<commit_message>
3NF - Completed normalisation to 3NF
</commit_message>
<xml_diff>
--- a/Assignments/Ass1/ca_normalisation.docx
+++ b/Assignments/Ass1/ca_normalisation.docx
@@ -43,6 +43,7 @@
     <w:p>
       <w:pPr>
         <w:rPr>
+          <w:rFonts w:asciiTheme="majorHAnsi" w:hAnsiTheme="majorHAnsi"/>
           <w:b/>
           <w:bCs/>
           <w:lang w:val="en-US"/>
@@ -50,6 +51,7 @@
       </w:pPr>
       <w:r>
         <w:rPr>
+          <w:rFonts w:asciiTheme="majorHAnsi" w:hAnsiTheme="majorHAnsi"/>
           <w:b/>
           <w:bCs/>
           <w:lang w:val="en-US"/>
@@ -59,24 +61,29 @@
     </w:p>
     <w:p>
       <w:pPr>
-        <w:rPr>
-          <w:lang w:val="en-US"/>
-        </w:rPr>
-      </w:pPr>
-      <w:r>
-        <w:rPr>
+        <w:spacing w:after="0" w:line="240" w:lineRule="auto"/>
+        <w:rPr>
+          <w:rFonts w:asciiTheme="majorHAnsi" w:hAnsiTheme="majorHAnsi"/>
+          <w:lang w:val="en-US"/>
+        </w:rPr>
+      </w:pPr>
+      <w:r>
+        <w:rPr>
+          <w:rFonts w:asciiTheme="majorHAnsi" w:hAnsiTheme="majorHAnsi"/>
           <w:lang w:val="en-US"/>
         </w:rPr>
         <w:t>COLLECTION_</w:t>
       </w:r>
       <w:r>
         <w:rPr>
+          <w:rFonts w:asciiTheme="majorHAnsi" w:hAnsiTheme="majorHAnsi"/>
           <w:lang w:val="en-US"/>
         </w:rPr>
         <w:t>REPORT (</w:t>
       </w:r>
       <w:r>
         <w:rPr>
+          <w:rFonts w:asciiTheme="majorHAnsi" w:hAnsiTheme="majorHAnsi"/>
           <w:lang w:val="en-US"/>
         </w:rPr>
         <w:t xml:space="preserve">contract_no, waste_type_id, waste_type_desc, </w:t>
@@ -84,48 +91,943 @@
     </w:p>
     <w:p>
       <w:pPr>
-        <w:rPr>
-          <w:lang w:val="en-US"/>
-        </w:rPr>
-      </w:pPr>
-      <w:proofErr w:type="spellStart"/>
-      <w:r>
-        <w:rPr>
-          <w:lang w:val="en-US"/>
+        <w:spacing w:after="0" w:line="240" w:lineRule="auto"/>
+        <w:rPr>
+          <w:rFonts w:asciiTheme="majorHAnsi" w:hAnsiTheme="majorHAnsi"/>
+          <w:lang w:val="en-US"/>
+        </w:rPr>
+      </w:pPr>
+      <w:r>
+        <w:rPr>
+          <w:rFonts w:asciiTheme="majorHAnsi" w:hAnsiTheme="majorHAnsi"/>
+          <w:lang w:val="en-US"/>
+        </w:rPr>
+        <w:t xml:space="preserve">collection_frequency, collect_date, truck_vin, truck_rego, </w:t>
+      </w:r>
+    </w:p>
+    <w:p>
+      <w:pPr>
+        <w:spacing w:after="0" w:line="240" w:lineRule="auto"/>
+        <w:rPr>
+          <w:rFonts w:asciiTheme="majorHAnsi" w:hAnsiTheme="majorHAnsi"/>
+          <w:lang w:val="en-US"/>
+        </w:rPr>
+      </w:pPr>
+      <w:proofErr w:type="spellStart"/>
+      <w:r>
+        <w:rPr>
+          <w:rFonts w:asciiTheme="majorHAnsi" w:hAnsiTheme="majorHAnsi"/>
+          <w:lang w:val="en-US"/>
+        </w:rPr>
+        <w:t>truck_make</w:t>
+      </w:r>
+      <w:proofErr w:type="spellEnd"/>
+      <w:r>
+        <w:rPr>
+          <w:rFonts w:asciiTheme="majorHAnsi" w:hAnsiTheme="majorHAnsi"/>
+          <w:lang w:val="en-US"/>
+        </w:rPr>
+        <w:t xml:space="preserve">, </w:t>
+      </w:r>
+      <w:proofErr w:type="spellStart"/>
+      <w:r>
+        <w:rPr>
+          <w:rFonts w:asciiTheme="majorHAnsi" w:hAnsiTheme="majorHAnsi"/>
+          <w:lang w:val="en-US"/>
+        </w:rPr>
+        <w:t>truck_model</w:t>
+      </w:r>
+      <w:proofErr w:type="spellEnd"/>
+      <w:r>
+        <w:rPr>
+          <w:rFonts w:asciiTheme="majorHAnsi" w:hAnsiTheme="majorHAnsi"/>
+          <w:lang w:val="en-US"/>
+        </w:rPr>
+        <w:t xml:space="preserve">, </w:t>
+      </w:r>
+      <w:proofErr w:type="spellStart"/>
+      <w:r>
+        <w:rPr>
+          <w:rFonts w:asciiTheme="majorHAnsi" w:hAnsiTheme="majorHAnsi"/>
+          <w:lang w:val="en-US"/>
+        </w:rPr>
+        <w:t>truck_year</w:t>
+      </w:r>
+      <w:proofErr w:type="spellEnd"/>
+      <w:r>
+        <w:rPr>
+          <w:rFonts w:asciiTheme="majorHAnsi" w:hAnsiTheme="majorHAnsi"/>
+          <w:lang w:val="en-US"/>
+        </w:rPr>
+        <w:t xml:space="preserve">, </w:t>
+      </w:r>
+    </w:p>
+    <w:p>
+      <w:pPr>
+        <w:spacing w:after="0" w:line="240" w:lineRule="auto"/>
+        <w:rPr>
+          <w:rFonts w:asciiTheme="majorHAnsi" w:hAnsiTheme="majorHAnsi"/>
+          <w:lang w:val="en-US"/>
+        </w:rPr>
+      </w:pPr>
+      <w:r>
+        <w:rPr>
+          <w:rFonts w:asciiTheme="majorHAnsi" w:hAnsiTheme="majorHAnsi"/>
+          <w:lang w:val="en-US"/>
+        </w:rPr>
+        <w:t>(bin_rfid, collected_kgs, overweight))</w:t>
+      </w:r>
+    </w:p>
+    <w:p>
+      <w:pPr>
+        <w:rPr>
+          <w:rFonts w:asciiTheme="majorHAnsi" w:hAnsiTheme="majorHAnsi"/>
+          <w:lang w:val="en-US"/>
+        </w:rPr>
+      </w:pPr>
+    </w:p>
+    <w:p>
+      <w:pPr>
+        <w:rPr>
+          <w:rFonts w:asciiTheme="majorHAnsi" w:hAnsiTheme="majorHAnsi"/>
+          <w:b/>
+          <w:bCs/>
+          <w:lang w:val="en-US"/>
+        </w:rPr>
+      </w:pPr>
+      <w:r>
+        <w:rPr>
+          <w:rFonts w:asciiTheme="majorHAnsi" w:hAnsiTheme="majorHAnsi"/>
+          <w:b/>
+          <w:bCs/>
+          <w:lang w:val="en-US"/>
+        </w:rPr>
+        <w:t>1NF</w:t>
+      </w:r>
+    </w:p>
+    <w:p>
+      <w:pPr>
+        <w:spacing w:after="0" w:line="240" w:lineRule="auto"/>
+        <w:rPr>
+          <w:rFonts w:asciiTheme="majorHAnsi" w:hAnsiTheme="majorHAnsi"/>
+          <w:lang w:val="en-US"/>
+        </w:rPr>
+      </w:pPr>
+      <w:r>
+        <w:rPr>
+          <w:rFonts w:asciiTheme="majorHAnsi" w:hAnsiTheme="majorHAnsi"/>
+          <w:lang w:val="en-US"/>
+        </w:rPr>
+        <w:t>COLLECTION_</w:t>
+      </w:r>
+      <w:r>
+        <w:rPr>
+          <w:rFonts w:asciiTheme="majorHAnsi" w:hAnsiTheme="majorHAnsi"/>
+          <w:lang w:val="en-US"/>
+        </w:rPr>
+        <w:t>REPORT (</w:t>
+      </w:r>
+      <w:r>
+        <w:rPr>
+          <w:rFonts w:asciiTheme="majorHAnsi" w:hAnsiTheme="majorHAnsi"/>
+          <w:u w:val="single"/>
+          <w:lang w:val="en-US"/>
+        </w:rPr>
+        <w:t>contract_no</w:t>
+      </w:r>
+      <w:r>
+        <w:rPr>
+          <w:rFonts w:asciiTheme="majorHAnsi" w:hAnsiTheme="majorHAnsi"/>
+          <w:lang w:val="en-US"/>
+        </w:rPr>
+        <w:t xml:space="preserve">, waste_type_id, waste_type_desc, </w:t>
+      </w:r>
+    </w:p>
+    <w:p>
+      <w:pPr>
+        <w:spacing w:after="0" w:line="240" w:lineRule="auto"/>
+        <w:rPr>
+          <w:rFonts w:asciiTheme="majorHAnsi" w:hAnsiTheme="majorHAnsi"/>
+          <w:lang w:val="en-US"/>
+        </w:rPr>
+      </w:pPr>
+      <w:r>
+        <w:rPr>
+          <w:rFonts w:asciiTheme="majorHAnsi" w:hAnsiTheme="majorHAnsi"/>
+          <w:lang w:val="en-US"/>
+        </w:rPr>
+        <w:t xml:space="preserve">collection_frequency, </w:t>
+      </w:r>
+      <w:r>
+        <w:rPr>
+          <w:rFonts w:asciiTheme="majorHAnsi" w:hAnsiTheme="majorHAnsi"/>
+          <w:u w:val="single"/>
+          <w:lang w:val="en-US"/>
+        </w:rPr>
+        <w:t>collect_date</w:t>
+      </w:r>
+      <w:r>
+        <w:rPr>
+          <w:rFonts w:asciiTheme="majorHAnsi" w:hAnsiTheme="majorHAnsi"/>
+          <w:lang w:val="en-US"/>
+        </w:rPr>
+        <w:t xml:space="preserve">, truck_vin, truck_rego, </w:t>
+      </w:r>
+    </w:p>
+    <w:p>
+      <w:pPr>
+        <w:spacing w:after="0" w:line="240" w:lineRule="auto"/>
+        <w:rPr>
+          <w:rFonts w:asciiTheme="majorHAnsi" w:hAnsiTheme="majorHAnsi"/>
+          <w:lang w:val="en-US"/>
+        </w:rPr>
+      </w:pPr>
+      <w:proofErr w:type="spellStart"/>
+      <w:r>
+        <w:rPr>
+          <w:rFonts w:asciiTheme="majorHAnsi" w:hAnsiTheme="majorHAnsi"/>
+          <w:lang w:val="en-US"/>
+        </w:rPr>
+        <w:t>truck_make</w:t>
+      </w:r>
+      <w:proofErr w:type="spellEnd"/>
+      <w:r>
+        <w:rPr>
+          <w:rFonts w:asciiTheme="majorHAnsi" w:hAnsiTheme="majorHAnsi"/>
+          <w:lang w:val="en-US"/>
+        </w:rPr>
+        <w:t xml:space="preserve">, </w:t>
+      </w:r>
+      <w:proofErr w:type="spellStart"/>
+      <w:r>
+        <w:rPr>
+          <w:rFonts w:asciiTheme="majorHAnsi" w:hAnsiTheme="majorHAnsi"/>
+          <w:lang w:val="en-US"/>
+        </w:rPr>
+        <w:t>truck_model</w:t>
+      </w:r>
+      <w:proofErr w:type="spellEnd"/>
+      <w:r>
+        <w:rPr>
+          <w:rFonts w:asciiTheme="majorHAnsi" w:hAnsiTheme="majorHAnsi"/>
+          <w:lang w:val="en-US"/>
+        </w:rPr>
+        <w:t xml:space="preserve">, </w:t>
+      </w:r>
+      <w:proofErr w:type="spellStart"/>
+      <w:r>
+        <w:rPr>
+          <w:rFonts w:asciiTheme="majorHAnsi" w:hAnsiTheme="majorHAnsi"/>
+          <w:lang w:val="en-US"/>
+        </w:rPr>
+        <w:t>truck_year</w:t>
+      </w:r>
+      <w:proofErr w:type="spellEnd"/>
+      <w:r>
+        <w:rPr>
+          <w:rFonts w:asciiTheme="majorHAnsi" w:hAnsiTheme="majorHAnsi"/>
+          <w:lang w:val="en-US"/>
+        </w:rPr>
+        <w:t xml:space="preserve">, </w:t>
+      </w:r>
+      <w:r>
+        <w:rPr>
+          <w:rFonts w:asciiTheme="majorHAnsi" w:hAnsiTheme="majorHAnsi"/>
+          <w:u w:val="single"/>
+          <w:lang w:val="en-US"/>
+        </w:rPr>
+        <w:t>bin_rfid</w:t>
+      </w:r>
+      <w:r>
+        <w:rPr>
+          <w:rFonts w:asciiTheme="majorHAnsi" w:hAnsiTheme="majorHAnsi"/>
+          <w:lang w:val="en-US"/>
+        </w:rPr>
+        <w:t xml:space="preserve">, </w:t>
+      </w:r>
+    </w:p>
+    <w:p>
+      <w:pPr>
+        <w:spacing w:after="0" w:line="240" w:lineRule="auto"/>
+        <w:rPr>
+          <w:rFonts w:asciiTheme="majorHAnsi" w:hAnsiTheme="majorHAnsi"/>
+          <w:lang w:val="en-US"/>
+        </w:rPr>
+      </w:pPr>
+      <w:r>
+        <w:rPr>
+          <w:rFonts w:asciiTheme="majorHAnsi" w:hAnsiTheme="majorHAnsi"/>
+          <w:lang w:val="en-US"/>
+        </w:rPr>
+        <w:t>collected_kgs, overweight)</w:t>
+      </w:r>
+    </w:p>
+    <w:p>
+      <w:pPr>
+        <w:pStyle w:val="font-claude-response-body"/>
+        <w:rPr>
+          <w:rFonts w:asciiTheme="majorHAnsi" w:hAnsiTheme="majorHAnsi"/>
+        </w:rPr>
+      </w:pPr>
+      <w:r>
+        <w:rPr>
+          <w:rStyle w:val="Strong"/>
+          <w:rFonts w:asciiTheme="majorHAnsi" w:hAnsiTheme="majorHAnsi"/>
+        </w:rPr>
+        <w:t>Candidate Keys:</w:t>
+      </w:r>
+    </w:p>
+    <w:p>
+      <w:pPr>
+        <w:pStyle w:val="whitespace-normal"/>
+        <w:numPr>
+          <w:ilvl w:val="0"/>
+          <w:numId w:val="1"/>
+        </w:numPr>
+        <w:rPr>
+          <w:rFonts w:asciiTheme="majorHAnsi" w:hAnsiTheme="majorHAnsi"/>
+        </w:rPr>
+      </w:pPr>
+      <w:r>
+        <w:rPr>
+          <w:rFonts w:asciiTheme="majorHAnsi" w:hAnsiTheme="majorHAnsi"/>
+        </w:rPr>
+        <w:t xml:space="preserve">CK: </w:t>
+      </w:r>
+      <w:proofErr w:type="spellStart"/>
+      <w:r>
+        <w:rPr>
+          <w:rFonts w:asciiTheme="majorHAnsi" w:hAnsiTheme="majorHAnsi"/>
+        </w:rPr>
+        <w:t>contract_no</w:t>
+      </w:r>
+      <w:proofErr w:type="spellEnd"/>
+      <w:r>
+        <w:rPr>
+          <w:rFonts w:asciiTheme="majorHAnsi" w:hAnsiTheme="majorHAnsi"/>
+        </w:rPr>
+        <w:t xml:space="preserve">, </w:t>
+      </w:r>
+      <w:proofErr w:type="spellStart"/>
+      <w:r>
+        <w:rPr>
+          <w:rFonts w:asciiTheme="majorHAnsi" w:hAnsiTheme="majorHAnsi"/>
+        </w:rPr>
+        <w:t>collect_date</w:t>
+      </w:r>
+      <w:proofErr w:type="spellEnd"/>
+      <w:r>
+        <w:rPr>
+          <w:rFonts w:asciiTheme="majorHAnsi" w:hAnsiTheme="majorHAnsi"/>
+        </w:rPr>
+        <w:t xml:space="preserve">, </w:t>
+      </w:r>
+      <w:proofErr w:type="spellStart"/>
+      <w:r>
+        <w:rPr>
+          <w:rFonts w:asciiTheme="majorHAnsi" w:hAnsiTheme="majorHAnsi"/>
+        </w:rPr>
+        <w:t>bin_rfid</w:t>
+      </w:r>
+      <w:proofErr w:type="spellEnd"/>
+    </w:p>
+    <w:p>
+      <w:pPr>
+        <w:pStyle w:val="whitespace-normal"/>
+        <w:numPr>
+          <w:ilvl w:val="0"/>
+          <w:numId w:val="1"/>
+        </w:numPr>
+        <w:rPr>
+          <w:rFonts w:asciiTheme="majorHAnsi" w:hAnsiTheme="majorHAnsi"/>
+        </w:rPr>
+      </w:pPr>
+      <w:r>
+        <w:rPr>
+          <w:rFonts w:asciiTheme="majorHAnsi" w:hAnsiTheme="majorHAnsi"/>
+        </w:rPr>
+        <w:t xml:space="preserve">CK: </w:t>
+      </w:r>
+      <w:proofErr w:type="spellStart"/>
+      <w:r>
+        <w:rPr>
+          <w:rFonts w:asciiTheme="majorHAnsi" w:hAnsiTheme="majorHAnsi"/>
+        </w:rPr>
+        <w:t>truck_vin</w:t>
+      </w:r>
+      <w:proofErr w:type="spellEnd"/>
+      <w:r>
+        <w:rPr>
+          <w:rFonts w:asciiTheme="majorHAnsi" w:hAnsiTheme="majorHAnsi"/>
+        </w:rPr>
+        <w:t xml:space="preserve">, </w:t>
+      </w:r>
+      <w:proofErr w:type="spellStart"/>
+      <w:r>
+        <w:rPr>
+          <w:rFonts w:asciiTheme="majorHAnsi" w:hAnsiTheme="majorHAnsi"/>
+        </w:rPr>
+        <w:t>collect_date</w:t>
+      </w:r>
+      <w:proofErr w:type="spellEnd"/>
+      <w:r>
+        <w:rPr>
+          <w:rFonts w:asciiTheme="majorHAnsi" w:hAnsiTheme="majorHAnsi"/>
+        </w:rPr>
+        <w:t xml:space="preserve">, </w:t>
+      </w:r>
+      <w:proofErr w:type="spellStart"/>
+      <w:r>
+        <w:rPr>
+          <w:rFonts w:asciiTheme="majorHAnsi" w:hAnsiTheme="majorHAnsi"/>
+        </w:rPr>
+        <w:t>bin_rfid</w:t>
+      </w:r>
+      <w:proofErr w:type="spellEnd"/>
+    </w:p>
+    <w:p>
+      <w:pPr>
+        <w:pStyle w:val="whitespace-normal"/>
+        <w:rPr>
+          <w:rFonts w:asciiTheme="majorHAnsi" w:hAnsiTheme="majorHAnsi"/>
+          <w:b/>
+          <w:bCs/>
+        </w:rPr>
+      </w:pPr>
+      <w:r>
+        <w:rPr>
+          <w:rFonts w:asciiTheme="majorHAnsi" w:hAnsiTheme="majorHAnsi"/>
+          <w:b/>
+          <w:bCs/>
+        </w:rPr>
+        <w:t>Partial dependencies:</w:t>
+      </w:r>
+    </w:p>
+    <w:p>
+      <w:pPr>
+        <w:pStyle w:val="ListParagraph"/>
+        <w:numPr>
+          <w:ilvl w:val="0"/>
+          <w:numId w:val="2"/>
+        </w:numPr>
+        <w:spacing w:after="0" w:line="240" w:lineRule="auto"/>
+        <w:rPr>
+          <w:rFonts w:asciiTheme="majorHAnsi" w:eastAsia="Times New Roman" w:hAnsiTheme="majorHAnsi" w:cs="Times New Roman"/>
+          <w:kern w:val="0"/>
+          <w:lang w:eastAsia="en-GB"/>
+          <w14:ligatures w14:val="none"/>
+        </w:rPr>
+      </w:pPr>
+      <w:proofErr w:type="spellStart"/>
+      <w:r>
+        <w:rPr>
+          <w:rFonts w:asciiTheme="majorHAnsi" w:eastAsia="Times New Roman" w:hAnsiTheme="majorHAnsi" w:cs="Times New Roman"/>
+          <w:kern w:val="0"/>
+          <w:lang w:eastAsia="en-GB"/>
+          <w14:ligatures w14:val="none"/>
+        </w:rPr>
+        <w:t>contract_no</w:t>
+      </w:r>
+      <w:proofErr w:type="spellEnd"/>
+      <w:r>
+        <w:rPr>
+          <w:rFonts w:asciiTheme="majorHAnsi" w:eastAsia="Times New Roman" w:hAnsiTheme="majorHAnsi" w:cs="Times New Roman"/>
+          <w:kern w:val="0"/>
+          <w:lang w:eastAsia="en-GB"/>
+          <w14:ligatures w14:val="none"/>
+        </w:rPr>
+        <w:t xml:space="preserve"> → </w:t>
+      </w:r>
+      <w:proofErr w:type="spellStart"/>
+      <w:r>
+        <w:rPr>
+          <w:rFonts w:asciiTheme="majorHAnsi" w:eastAsia="Times New Roman" w:hAnsiTheme="majorHAnsi" w:cs="Times New Roman"/>
+          <w:kern w:val="0"/>
+          <w:lang w:eastAsia="en-GB"/>
+          <w14:ligatures w14:val="none"/>
+        </w:rPr>
+        <w:t>waste_type_id</w:t>
+      </w:r>
+      <w:proofErr w:type="spellEnd"/>
+      <w:r>
+        <w:rPr>
+          <w:rFonts w:asciiTheme="majorHAnsi" w:eastAsia="Times New Roman" w:hAnsiTheme="majorHAnsi" w:cs="Times New Roman"/>
+          <w:kern w:val="0"/>
+          <w:lang w:eastAsia="en-GB"/>
+          <w14:ligatures w14:val="none"/>
+        </w:rPr>
+        <w:t xml:space="preserve">, </w:t>
+      </w:r>
+      <w:proofErr w:type="spellStart"/>
+      <w:r>
+        <w:rPr>
+          <w:rFonts w:asciiTheme="majorHAnsi" w:eastAsia="Times New Roman" w:hAnsiTheme="majorHAnsi" w:cs="Times New Roman"/>
+          <w:kern w:val="0"/>
+          <w:lang w:eastAsia="en-GB"/>
+          <w14:ligatures w14:val="none"/>
+        </w:rPr>
+        <w:t>waste_type_desc</w:t>
+      </w:r>
+      <w:proofErr w:type="spellEnd"/>
+      <w:r>
+        <w:rPr>
+          <w:rFonts w:asciiTheme="majorHAnsi" w:eastAsia="Times New Roman" w:hAnsiTheme="majorHAnsi" w:cs="Times New Roman"/>
+          <w:kern w:val="0"/>
+          <w:lang w:eastAsia="en-GB"/>
+          <w14:ligatures w14:val="none"/>
+        </w:rPr>
+        <w:t xml:space="preserve">, </w:t>
+      </w:r>
+      <w:proofErr w:type="spellStart"/>
+      <w:r>
+        <w:rPr>
+          <w:rFonts w:asciiTheme="majorHAnsi" w:eastAsia="Times New Roman" w:hAnsiTheme="majorHAnsi" w:cs="Times New Roman"/>
+          <w:kern w:val="0"/>
+          <w:lang w:eastAsia="en-GB"/>
+          <w14:ligatures w14:val="none"/>
         </w:rPr>
         <w:t>collection_frequency</w:t>
       </w:r>
       <w:proofErr w:type="spellEnd"/>
       <w:r>
         <w:rPr>
-          <w:lang w:val="en-US"/>
-        </w:rPr>
-        <w:t xml:space="preserve">, collect_date, truck_vin, truck_rego, </w:t>
-      </w:r>
-    </w:p>
-    <w:p>
-      <w:pPr>
-        <w:rPr>
-          <w:lang w:val="en-US"/>
-        </w:rPr>
-      </w:pPr>
-      <w:proofErr w:type="spellStart"/>
-      <w:r>
-        <w:rPr>
-          <w:lang w:val="en-US"/>
+          <w:rFonts w:asciiTheme="majorHAnsi" w:eastAsia="Times New Roman" w:hAnsiTheme="majorHAnsi" w:cs="Times New Roman"/>
+          <w:kern w:val="0"/>
+          <w:lang w:eastAsia="en-GB"/>
+          <w14:ligatures w14:val="none"/>
+        </w:rPr>
+        <w:t xml:space="preserve"> </w:t>
+      </w:r>
+    </w:p>
+    <w:p>
+      <w:pPr>
+        <w:pStyle w:val="ListParagraph"/>
+        <w:numPr>
+          <w:ilvl w:val="0"/>
+          <w:numId w:val="2"/>
+        </w:numPr>
+        <w:spacing w:after="0" w:line="240" w:lineRule="auto"/>
+        <w:rPr>
+          <w:rFonts w:asciiTheme="majorHAnsi" w:eastAsia="Times New Roman" w:hAnsiTheme="majorHAnsi" w:cs="Times New Roman"/>
+          <w:kern w:val="0"/>
+          <w:lang w:eastAsia="en-GB"/>
+          <w14:ligatures w14:val="none"/>
+        </w:rPr>
+      </w:pPr>
+      <w:proofErr w:type="spellStart"/>
+      <w:r>
+        <w:rPr>
+          <w:rFonts w:asciiTheme="majorHAnsi" w:eastAsia="Times New Roman" w:hAnsiTheme="majorHAnsi" w:cs="Times New Roman"/>
+          <w:kern w:val="0"/>
+          <w:lang w:eastAsia="en-GB"/>
+          <w14:ligatures w14:val="none"/>
+        </w:rPr>
+        <w:t>c</w:t>
+      </w:r>
+      <w:r>
+        <w:rPr>
+          <w:rFonts w:asciiTheme="majorHAnsi" w:eastAsia="Times New Roman" w:hAnsiTheme="majorHAnsi" w:cs="Times New Roman"/>
+          <w:kern w:val="0"/>
+          <w:lang w:eastAsia="en-GB"/>
+          <w14:ligatures w14:val="none"/>
+        </w:rPr>
+        <w:t>ollect_</w:t>
+      </w:r>
+      <w:proofErr w:type="gramStart"/>
+      <w:r>
+        <w:rPr>
+          <w:rFonts w:asciiTheme="majorHAnsi" w:eastAsia="Times New Roman" w:hAnsiTheme="majorHAnsi" w:cs="Times New Roman"/>
+          <w:kern w:val="0"/>
+          <w:lang w:eastAsia="en-GB"/>
+          <w14:ligatures w14:val="none"/>
+        </w:rPr>
+        <w:t>date</w:t>
+      </w:r>
+      <w:proofErr w:type="spellEnd"/>
+      <w:r>
+        <w:rPr>
+          <w:rFonts w:asciiTheme="majorHAnsi" w:eastAsia="Times New Roman" w:hAnsiTheme="majorHAnsi" w:cs="Times New Roman"/>
+          <w:kern w:val="0"/>
+          <w:lang w:eastAsia="en-GB"/>
+          <w14:ligatures w14:val="none"/>
+        </w:rPr>
+        <w:t xml:space="preserve"> </w:t>
+      </w:r>
+      <w:r>
+        <w:rPr>
+          <w:rFonts w:asciiTheme="majorHAnsi" w:eastAsia="Times New Roman" w:hAnsiTheme="majorHAnsi" w:cs="Times New Roman"/>
+          <w:kern w:val="0"/>
+          <w:lang w:eastAsia="en-GB"/>
+          <w14:ligatures w14:val="none"/>
+        </w:rPr>
+        <w:t>,</w:t>
+      </w:r>
+      <w:proofErr w:type="gramEnd"/>
+      <w:r>
+        <w:rPr>
+          <w:rFonts w:asciiTheme="majorHAnsi" w:eastAsia="Times New Roman" w:hAnsiTheme="majorHAnsi" w:cs="Times New Roman"/>
+          <w:kern w:val="0"/>
+          <w:lang w:eastAsia="en-GB"/>
+          <w14:ligatures w14:val="none"/>
+        </w:rPr>
+        <w:t xml:space="preserve"> </w:t>
+      </w:r>
+      <w:proofErr w:type="spellStart"/>
+      <w:r>
+        <w:rPr>
+          <w:rFonts w:asciiTheme="majorHAnsi" w:eastAsia="Times New Roman" w:hAnsiTheme="majorHAnsi" w:cs="Times New Roman"/>
+          <w:kern w:val="0"/>
+          <w:lang w:eastAsia="en-GB"/>
+          <w14:ligatures w14:val="none"/>
+        </w:rPr>
+        <w:t>contract_no</w:t>
+      </w:r>
+      <w:proofErr w:type="spellEnd"/>
+      <w:r>
+        <w:rPr>
+          <w:rFonts w:asciiTheme="majorHAnsi" w:eastAsia="Times New Roman" w:hAnsiTheme="majorHAnsi" w:cs="Times New Roman"/>
+          <w:kern w:val="0"/>
+          <w:lang w:eastAsia="en-GB"/>
+          <w14:ligatures w14:val="none"/>
+        </w:rPr>
+        <w:t xml:space="preserve"> → </w:t>
+      </w:r>
+      <w:proofErr w:type="spellStart"/>
+      <w:r>
+        <w:rPr>
+          <w:rFonts w:asciiTheme="majorHAnsi" w:eastAsia="Times New Roman" w:hAnsiTheme="majorHAnsi" w:cs="Times New Roman"/>
+          <w:kern w:val="0"/>
+          <w:lang w:eastAsia="en-GB"/>
+          <w14:ligatures w14:val="none"/>
+        </w:rPr>
+        <w:t>truck_vin</w:t>
+      </w:r>
+      <w:proofErr w:type="spellEnd"/>
+      <w:r>
+        <w:rPr>
+          <w:rFonts w:asciiTheme="majorHAnsi" w:eastAsia="Times New Roman" w:hAnsiTheme="majorHAnsi" w:cs="Times New Roman"/>
+          <w:kern w:val="0"/>
+          <w:lang w:eastAsia="en-GB"/>
+          <w14:ligatures w14:val="none"/>
+        </w:rPr>
+        <w:t xml:space="preserve">, </w:t>
+      </w:r>
+      <w:proofErr w:type="spellStart"/>
+      <w:r>
+        <w:rPr>
+          <w:rFonts w:asciiTheme="majorHAnsi" w:eastAsia="Times New Roman" w:hAnsiTheme="majorHAnsi" w:cs="Times New Roman"/>
+          <w:kern w:val="0"/>
+          <w:lang w:eastAsia="en-GB"/>
+          <w14:ligatures w14:val="none"/>
+        </w:rPr>
+        <w:t>truck_rego</w:t>
+      </w:r>
+      <w:proofErr w:type="spellEnd"/>
+      <w:r>
+        <w:rPr>
+          <w:rFonts w:asciiTheme="majorHAnsi" w:eastAsia="Times New Roman" w:hAnsiTheme="majorHAnsi" w:cs="Times New Roman"/>
+          <w:kern w:val="0"/>
+          <w:lang w:eastAsia="en-GB"/>
+          <w14:ligatures w14:val="none"/>
+        </w:rPr>
+        <w:t xml:space="preserve">, </w:t>
+      </w:r>
+      <w:proofErr w:type="spellStart"/>
+      <w:r>
+        <w:rPr>
+          <w:rFonts w:asciiTheme="majorHAnsi" w:eastAsia="Times New Roman" w:hAnsiTheme="majorHAnsi" w:cs="Times New Roman"/>
+          <w:kern w:val="0"/>
+          <w:lang w:eastAsia="en-GB"/>
+          <w14:ligatures w14:val="none"/>
         </w:rPr>
         <w:t>truck_make</w:t>
       </w:r>
       <w:proofErr w:type="spellEnd"/>
       <w:r>
         <w:rPr>
-          <w:lang w:val="en-US"/>
+          <w:rFonts w:asciiTheme="majorHAnsi" w:eastAsia="Times New Roman" w:hAnsiTheme="majorHAnsi" w:cs="Times New Roman"/>
+          <w:kern w:val="0"/>
+          <w:lang w:eastAsia="en-GB"/>
+          <w14:ligatures w14:val="none"/>
         </w:rPr>
         <w:t xml:space="preserve">, </w:t>
       </w:r>
       <w:proofErr w:type="spellStart"/>
       <w:r>
         <w:rPr>
+          <w:rFonts w:asciiTheme="majorHAnsi" w:eastAsia="Times New Roman" w:hAnsiTheme="majorHAnsi" w:cs="Times New Roman"/>
+          <w:kern w:val="0"/>
+          <w:lang w:eastAsia="en-GB"/>
+          <w14:ligatures w14:val="none"/>
+        </w:rPr>
+        <w:t>truck_</w:t>
+      </w:r>
+      <w:proofErr w:type="gramStart"/>
+      <w:r>
+        <w:rPr>
+          <w:rFonts w:asciiTheme="majorHAnsi" w:eastAsia="Times New Roman" w:hAnsiTheme="majorHAnsi" w:cs="Times New Roman"/>
+          <w:kern w:val="0"/>
+          <w:lang w:eastAsia="en-GB"/>
+          <w14:ligatures w14:val="none"/>
+        </w:rPr>
+        <w:t>model,truck</w:t>
+      </w:r>
+      <w:proofErr w:type="gramEnd"/>
+      <w:r>
+        <w:rPr>
+          <w:rFonts w:asciiTheme="majorHAnsi" w:eastAsia="Times New Roman" w:hAnsiTheme="majorHAnsi" w:cs="Times New Roman"/>
+          <w:kern w:val="0"/>
+          <w:lang w:eastAsia="en-GB"/>
+          <w14:ligatures w14:val="none"/>
+        </w:rPr>
+        <w:t>_year</w:t>
+      </w:r>
+      <w:proofErr w:type="spellEnd"/>
+    </w:p>
+    <w:p>
+      <w:pPr>
+        <w:pStyle w:val="ListParagraph"/>
+        <w:numPr>
+          <w:ilvl w:val="0"/>
+          <w:numId w:val="2"/>
+        </w:numPr>
+        <w:spacing w:after="0" w:line="240" w:lineRule="auto"/>
+        <w:rPr>
+          <w:rFonts w:asciiTheme="majorHAnsi" w:eastAsia="Times New Roman" w:hAnsiTheme="majorHAnsi" w:cs="Times New Roman"/>
+          <w:kern w:val="0"/>
+          <w:lang w:eastAsia="en-GB"/>
+          <w14:ligatures w14:val="none"/>
+        </w:rPr>
+      </w:pPr>
+      <w:proofErr w:type="spellStart"/>
+      <w:r>
+        <w:rPr>
+          <w:rFonts w:asciiTheme="majorHAnsi" w:hAnsiTheme="majorHAnsi"/>
+        </w:rPr>
+        <w:t>bin_rfid</w:t>
+      </w:r>
+      <w:proofErr w:type="spellEnd"/>
+      <w:r>
+        <w:rPr>
+          <w:rFonts w:asciiTheme="majorHAnsi" w:hAnsiTheme="majorHAnsi"/>
+        </w:rPr>
+        <w:t xml:space="preserve"> → </w:t>
+      </w:r>
+      <w:proofErr w:type="spellStart"/>
+      <w:r>
+        <w:rPr>
+          <w:rFonts w:asciiTheme="majorHAnsi" w:hAnsiTheme="majorHAnsi"/>
+        </w:rPr>
+        <w:t>collected_kgs</w:t>
+      </w:r>
+      <w:proofErr w:type="spellEnd"/>
+      <w:r>
+        <w:rPr>
+          <w:rFonts w:asciiTheme="majorHAnsi" w:hAnsiTheme="majorHAnsi"/>
+        </w:rPr>
+        <w:t>, overweight</w:t>
+      </w:r>
+    </w:p>
+    <w:p>
+      <w:pPr>
+        <w:spacing w:line="240" w:lineRule="auto"/>
+        <w:rPr>
+          <w:lang w:val="en-US"/>
+        </w:rPr>
+      </w:pPr>
+    </w:p>
+    <w:p>
+      <w:pPr>
+        <w:spacing w:line="240" w:lineRule="auto"/>
+        <w:rPr>
+          <w:lang w:val="en-US"/>
+        </w:rPr>
+      </w:pPr>
+    </w:p>
+    <w:p>
+      <w:pPr>
+        <w:spacing w:line="240" w:lineRule="auto"/>
+        <w:rPr>
+          <w:b/>
+          <w:bCs/>
+          <w:sz w:val="26"/>
+          <w:szCs w:val="26"/>
+          <w:lang w:val="en-US"/>
+        </w:rPr>
+      </w:pPr>
+      <w:r>
+        <w:rPr>
+          <w:b/>
+          <w:bCs/>
+          <w:sz w:val="26"/>
+          <w:szCs w:val="26"/>
+          <w:lang w:val="en-US"/>
+        </w:rPr>
+        <w:t>2NF</w:t>
+      </w:r>
+    </w:p>
+    <w:p>
+      <w:pPr>
+        <w:spacing w:after="0" w:line="240" w:lineRule="auto"/>
+        <w:rPr>
+          <w:rFonts w:asciiTheme="majorHAnsi" w:hAnsiTheme="majorHAnsi"/>
+          <w:lang w:val="en-US"/>
+        </w:rPr>
+      </w:pPr>
+      <w:r>
+        <w:rPr>
+          <w:rFonts w:asciiTheme="majorHAnsi" w:hAnsiTheme="majorHAnsi"/>
+          <w:lang w:val="en-US"/>
+        </w:rPr>
+        <w:t>CONTRACT_</w:t>
+      </w:r>
+      <w:r>
+        <w:rPr>
+          <w:rFonts w:asciiTheme="majorHAnsi" w:hAnsiTheme="majorHAnsi"/>
+          <w:lang w:val="en-US"/>
+        </w:rPr>
+        <w:t>WASTE (</w:t>
+      </w:r>
+      <w:r>
+        <w:rPr>
+          <w:rFonts w:asciiTheme="majorHAnsi" w:hAnsiTheme="majorHAnsi"/>
+          <w:u w:val="single"/>
+          <w:lang w:val="en-US"/>
+        </w:rPr>
+        <w:t>contract_no</w:t>
+      </w:r>
+      <w:r>
+        <w:rPr>
+          <w:rFonts w:asciiTheme="majorHAnsi" w:hAnsiTheme="majorHAnsi"/>
+          <w:lang w:val="en-US"/>
+        </w:rPr>
+        <w:t xml:space="preserve">, waste_type_id, waste_type_desc, </w:t>
+      </w:r>
+    </w:p>
+    <w:p>
+      <w:pPr>
+        <w:spacing w:after="0" w:line="240" w:lineRule="auto"/>
+        <w:rPr>
+          <w:rFonts w:asciiTheme="majorHAnsi" w:hAnsiTheme="majorHAnsi"/>
+          <w:lang w:val="en-US"/>
+        </w:rPr>
+      </w:pPr>
+      <w:r>
+        <w:rPr>
+          <w:rFonts w:asciiTheme="majorHAnsi" w:hAnsiTheme="majorHAnsi"/>
+          <w:lang w:val="en-US"/>
+        </w:rPr>
+        <w:t>collection_frequency)</w:t>
+      </w:r>
+    </w:p>
+    <w:p>
+      <w:pPr>
+        <w:spacing w:line="240" w:lineRule="auto"/>
+        <w:rPr>
+          <w:rFonts w:asciiTheme="majorHAnsi" w:hAnsiTheme="majorHAnsi"/>
+          <w:lang w:val="en-US"/>
+        </w:rPr>
+      </w:pPr>
+      <w:r>
+        <w:rPr>
+          <w:rFonts w:asciiTheme="majorHAnsi" w:hAnsiTheme="majorHAnsi"/>
+          <w:b/>
+          <w:bCs/>
+          <w:lang w:val="en-US"/>
+        </w:rPr>
+        <w:t>CK</w:t>
+      </w:r>
+      <w:r>
+        <w:rPr>
+          <w:rFonts w:asciiTheme="majorHAnsi" w:hAnsiTheme="majorHAnsi"/>
+          <w:lang w:val="en-US"/>
+        </w:rPr>
+        <w:t>: contract_no</w:t>
+      </w:r>
+    </w:p>
+    <w:p>
+      <w:pPr>
+        <w:spacing w:line="240" w:lineRule="auto"/>
+        <w:rPr>
+          <w:rFonts w:asciiTheme="majorHAnsi" w:hAnsiTheme="majorHAnsi"/>
+          <w:lang w:val="en-US"/>
+        </w:rPr>
+      </w:pPr>
+    </w:p>
+    <w:p>
+      <w:pPr>
+        <w:spacing w:after="0" w:line="240" w:lineRule="auto"/>
+        <w:rPr>
+          <w:rFonts w:asciiTheme="majorHAnsi" w:hAnsiTheme="majorHAnsi"/>
+          <w:lang w:val="en-US"/>
+        </w:rPr>
+      </w:pPr>
+      <w:r>
+        <w:rPr>
+          <w:rFonts w:asciiTheme="majorHAnsi" w:hAnsiTheme="majorHAnsi"/>
+          <w:lang w:val="en-US"/>
+        </w:rPr>
+        <w:t>COLLECTION (</w:t>
+      </w:r>
+      <w:r>
+        <w:rPr>
+          <w:rFonts w:asciiTheme="majorHAnsi" w:hAnsiTheme="majorHAnsi"/>
+          <w:u w:val="single"/>
+          <w:lang w:val="en-US"/>
+        </w:rPr>
+        <w:t>contract_no</w:t>
+      </w:r>
+      <w:r>
+        <w:rPr>
+          <w:rFonts w:asciiTheme="majorHAnsi" w:hAnsiTheme="majorHAnsi"/>
+          <w:lang w:val="en-US"/>
+        </w:rPr>
+        <w:t xml:space="preserve">, </w:t>
+      </w:r>
+      <w:r>
+        <w:rPr>
+          <w:rFonts w:asciiTheme="majorHAnsi" w:hAnsiTheme="majorHAnsi"/>
+          <w:u w:val="single"/>
+          <w:lang w:val="en-US"/>
+        </w:rPr>
+        <w:t>collect_date</w:t>
+      </w:r>
+      <w:r>
+        <w:rPr>
+          <w:rFonts w:asciiTheme="majorHAnsi" w:hAnsiTheme="majorHAnsi"/>
+          <w:lang w:val="en-US"/>
+        </w:rPr>
+        <w:t xml:space="preserve">, truck_vin, truck_rego, </w:t>
+      </w:r>
+    </w:p>
+    <w:p>
+      <w:pPr>
+        <w:spacing w:after="0" w:line="240" w:lineRule="auto"/>
+        <w:rPr>
+          <w:rFonts w:asciiTheme="majorHAnsi" w:hAnsiTheme="majorHAnsi"/>
+          <w:lang w:val="en-US"/>
+        </w:rPr>
+      </w:pPr>
+      <w:proofErr w:type="spellStart"/>
+      <w:r>
+        <w:rPr>
+          <w:rFonts w:asciiTheme="majorHAnsi" w:hAnsiTheme="majorHAnsi"/>
+          <w:lang w:val="en-US"/>
+        </w:rPr>
+        <w:t>truck_make</w:t>
+      </w:r>
+      <w:proofErr w:type="spellEnd"/>
+      <w:r>
+        <w:rPr>
+          <w:rFonts w:asciiTheme="majorHAnsi" w:hAnsiTheme="majorHAnsi"/>
+          <w:lang w:val="en-US"/>
+        </w:rPr>
+        <w:t xml:space="preserve">, </w:t>
+      </w:r>
+      <w:proofErr w:type="spellStart"/>
+      <w:r>
+        <w:rPr>
+          <w:rFonts w:asciiTheme="majorHAnsi" w:hAnsiTheme="majorHAnsi"/>
           <w:lang w:val="en-US"/>
         </w:rPr>
         <w:t>truck_model</w:t>
@@ -133,6 +1035,7 @@
       <w:proofErr w:type="spellEnd"/>
       <w:r>
         <w:rPr>
+          <w:rFonts w:asciiTheme="majorHAnsi" w:hAnsiTheme="majorHAnsi"/>
           <w:lang w:val="en-US"/>
         </w:rPr>
         <w:t xml:space="preserve">, </w:t>
@@ -140,6 +1043,7 @@
       <w:proofErr w:type="spellStart"/>
       <w:r>
         <w:rPr>
+          <w:rFonts w:asciiTheme="majorHAnsi" w:hAnsiTheme="majorHAnsi"/>
           <w:lang w:val="en-US"/>
         </w:rPr>
         <w:t>truck_year</w:t>
@@ -147,50 +1051,855 @@
       <w:proofErr w:type="spellEnd"/>
       <w:r>
         <w:rPr>
+          <w:rFonts w:asciiTheme="majorHAnsi" w:hAnsiTheme="majorHAnsi"/>
+          <w:lang w:val="en-US"/>
+        </w:rPr>
+        <w:t>)</w:t>
+      </w:r>
+    </w:p>
+    <w:p>
+      <w:pPr>
+        <w:spacing w:after="0" w:line="240" w:lineRule="auto"/>
+        <w:rPr>
+          <w:rFonts w:asciiTheme="majorHAnsi" w:hAnsiTheme="majorHAnsi"/>
+          <w:b/>
+          <w:bCs/>
+          <w:lang w:val="en-US"/>
+        </w:rPr>
+      </w:pPr>
+    </w:p>
+    <w:p>
+      <w:pPr>
+        <w:spacing w:after="0" w:line="240" w:lineRule="auto"/>
+        <w:rPr>
+          <w:rFonts w:asciiTheme="majorHAnsi" w:hAnsiTheme="majorHAnsi"/>
+          <w:lang w:val="en-US"/>
+        </w:rPr>
+      </w:pPr>
+      <w:r>
+        <w:rPr>
+          <w:rFonts w:asciiTheme="majorHAnsi" w:hAnsiTheme="majorHAnsi"/>
+          <w:b/>
+          <w:bCs/>
+          <w:lang w:val="en-US"/>
+        </w:rPr>
+        <w:t>CK</w:t>
+      </w:r>
+      <w:r>
+        <w:rPr>
+          <w:rFonts w:asciiTheme="majorHAnsi" w:hAnsiTheme="majorHAnsi"/>
+          <w:lang w:val="en-US"/>
+        </w:rPr>
+        <w:t>: contract_no, collect_date</w:t>
+      </w:r>
+    </w:p>
+    <w:p>
+      <w:pPr>
+        <w:spacing w:after="0" w:line="240" w:lineRule="auto"/>
+        <w:rPr>
+          <w:rFonts w:asciiTheme="majorHAnsi" w:hAnsiTheme="majorHAnsi"/>
+          <w:lang w:val="en-US"/>
+        </w:rPr>
+      </w:pPr>
+      <w:r>
+        <w:rPr>
+          <w:rFonts w:asciiTheme="majorHAnsi" w:hAnsiTheme="majorHAnsi"/>
+          <w:b/>
+          <w:bCs/>
+          <w:lang w:val="en-US"/>
+        </w:rPr>
+        <w:t>CK</w:t>
+      </w:r>
+      <w:r>
+        <w:rPr>
+          <w:rFonts w:asciiTheme="majorHAnsi" w:hAnsiTheme="majorHAnsi"/>
+          <w:lang w:val="en-US"/>
+        </w:rPr>
+        <w:t>: truck_vin, collect_date</w:t>
+      </w:r>
+    </w:p>
+    <w:p>
+      <w:pPr>
+        <w:spacing w:line="240" w:lineRule="auto"/>
+        <w:rPr>
+          <w:rFonts w:asciiTheme="majorHAnsi" w:hAnsiTheme="majorHAnsi"/>
+          <w:lang w:val="en-US"/>
+        </w:rPr>
+      </w:pPr>
+    </w:p>
+    <w:p>
+      <w:pPr>
+        <w:spacing w:after="0" w:line="240" w:lineRule="auto"/>
+        <w:rPr>
+          <w:rFonts w:asciiTheme="majorHAnsi" w:hAnsiTheme="majorHAnsi"/>
+          <w:lang w:val="en-US"/>
+        </w:rPr>
+      </w:pPr>
+      <w:r>
+        <w:rPr>
+          <w:rFonts w:asciiTheme="majorHAnsi" w:hAnsiTheme="majorHAnsi"/>
+          <w:lang w:val="en-US"/>
+        </w:rPr>
+        <w:t>BIN_</w:t>
+      </w:r>
+      <w:r>
+        <w:rPr>
+          <w:rFonts w:asciiTheme="majorHAnsi" w:hAnsiTheme="majorHAnsi"/>
+          <w:lang w:val="en-US"/>
+        </w:rPr>
+        <w:t>COLLECTION (</w:t>
+      </w:r>
+      <w:r>
+        <w:rPr>
+          <w:rFonts w:asciiTheme="majorHAnsi" w:hAnsiTheme="majorHAnsi"/>
+          <w:u w:val="single"/>
+          <w:lang w:val="en-US"/>
+        </w:rPr>
+        <w:t>contract_no</w:t>
+      </w:r>
+      <w:r>
+        <w:rPr>
+          <w:rFonts w:asciiTheme="majorHAnsi" w:hAnsiTheme="majorHAnsi"/>
           <w:lang w:val="en-US"/>
         </w:rPr>
         <w:t xml:space="preserve">, </w:t>
       </w:r>
-    </w:p>
-    <w:p>
-      <w:pPr>
-        <w:rPr>
-          <w:lang w:val="en-US"/>
-        </w:rPr>
-      </w:pPr>
-      <w:r>
-        <w:rPr>
-          <w:lang w:val="en-US"/>
-        </w:rPr>
-        <w:t>(</w:t>
-      </w:r>
-      <w:proofErr w:type="spellStart"/>
-      <w:r>
-        <w:rPr>
+      <w:r>
+        <w:rPr>
+          <w:rFonts w:asciiTheme="majorHAnsi" w:hAnsiTheme="majorHAnsi"/>
+          <w:u w:val="single"/>
+          <w:lang w:val="en-US"/>
+        </w:rPr>
+        <w:t>collect_date</w:t>
+      </w:r>
+      <w:r>
+        <w:rPr>
+          <w:rFonts w:asciiTheme="majorHAnsi" w:hAnsiTheme="majorHAnsi"/>
+          <w:lang w:val="en-US"/>
+        </w:rPr>
+        <w:t xml:space="preserve">, </w:t>
+      </w:r>
+      <w:r>
+        <w:rPr>
+          <w:rFonts w:asciiTheme="majorHAnsi" w:hAnsiTheme="majorHAnsi"/>
+          <w:u w:val="single"/>
           <w:lang w:val="en-US"/>
         </w:rPr>
         <w:t>bin_rfid</w:t>
       </w:r>
-      <w:proofErr w:type="spellEnd"/>
-      <w:r>
-        <w:rPr>
+      <w:r>
+        <w:rPr>
+          <w:rFonts w:asciiTheme="majorHAnsi" w:hAnsiTheme="majorHAnsi"/>
           <w:lang w:val="en-US"/>
         </w:rPr>
         <w:t xml:space="preserve">, </w:t>
       </w:r>
-      <w:proofErr w:type="spellStart"/>
-      <w:r>
-        <w:rPr>
-          <w:lang w:val="en-US"/>
-        </w:rPr>
-        <w:t>collected_kgs</w:t>
-      </w:r>
-      <w:proofErr w:type="spellEnd"/>
-      <w:r>
-        <w:rPr>
-          <w:lang w:val="en-US"/>
-        </w:rPr>
-        <w:t>, overweight))</w:t>
+    </w:p>
+    <w:p>
+      <w:pPr>
+        <w:spacing w:after="0" w:line="240" w:lineRule="auto"/>
+        <w:rPr>
+          <w:rFonts w:asciiTheme="majorHAnsi" w:hAnsiTheme="majorHAnsi"/>
+          <w:lang w:val="en-US"/>
+        </w:rPr>
+      </w:pPr>
+      <w:r>
+        <w:rPr>
+          <w:rFonts w:asciiTheme="majorHAnsi" w:hAnsiTheme="majorHAnsi"/>
+          <w:lang w:val="en-US"/>
+        </w:rPr>
+        <w:lastRenderedPageBreak/>
+        <w:t>collected_kgs, overweight)</w:t>
+      </w:r>
+    </w:p>
+    <w:p>
+      <w:pPr>
+        <w:spacing w:line="240" w:lineRule="auto"/>
+        <w:rPr>
+          <w:rFonts w:asciiTheme="majorHAnsi" w:hAnsiTheme="majorHAnsi"/>
+          <w:lang w:val="en-US"/>
+        </w:rPr>
+      </w:pPr>
+      <w:r>
+        <w:rPr>
+          <w:rFonts w:asciiTheme="majorHAnsi" w:hAnsiTheme="majorHAnsi"/>
+          <w:b/>
+          <w:bCs/>
+          <w:lang w:val="en-US"/>
+        </w:rPr>
+        <w:t>CK</w:t>
+      </w:r>
+      <w:r>
+        <w:rPr>
+          <w:rFonts w:asciiTheme="majorHAnsi" w:hAnsiTheme="majorHAnsi"/>
+          <w:lang w:val="en-US"/>
+        </w:rPr>
+        <w:t>: contract_no, collect_date, bin_rfid</w:t>
+      </w:r>
+    </w:p>
+    <w:p>
+      <w:pPr>
+        <w:spacing w:line="240" w:lineRule="auto"/>
+        <w:rPr>
+          <w:rFonts w:asciiTheme="majorHAnsi" w:hAnsiTheme="majorHAnsi"/>
+          <w:lang w:val="en-US"/>
+        </w:rPr>
+      </w:pPr>
+    </w:p>
+    <w:p>
+      <w:pPr>
+        <w:spacing w:after="0" w:line="240" w:lineRule="auto"/>
+        <w:rPr>
+          <w:rFonts w:asciiTheme="majorHAnsi" w:hAnsiTheme="majorHAnsi"/>
+          <w:b/>
+          <w:bCs/>
+          <w:lang w:val="en-US"/>
+        </w:rPr>
+      </w:pPr>
+      <w:r>
+        <w:rPr>
+          <w:rFonts w:asciiTheme="majorHAnsi" w:hAnsiTheme="majorHAnsi"/>
+          <w:b/>
+          <w:bCs/>
+          <w:lang w:val="en-US"/>
+        </w:rPr>
+        <w:t>Transitive dependencies</w:t>
+      </w:r>
+      <w:r>
+        <w:rPr>
+          <w:rFonts w:asciiTheme="majorHAnsi" w:hAnsiTheme="majorHAnsi"/>
+          <w:b/>
+          <w:bCs/>
+          <w:lang w:val="en-US"/>
+        </w:rPr>
+        <w:t>:</w:t>
+      </w:r>
+    </w:p>
+    <w:p>
+      <w:pPr>
+        <w:spacing w:after="0" w:line="240" w:lineRule="auto"/>
+      </w:pPr>
+      <w:proofErr w:type="spellStart"/>
+      <w:r>
+        <w:t>waste_type_id</w:t>
+      </w:r>
+      <w:proofErr w:type="spellEnd"/>
+      <w:r>
+        <w:t xml:space="preserve"> → </w:t>
+      </w:r>
+      <w:proofErr w:type="spellStart"/>
+      <w:r>
+        <w:t>waste_type_desc</w:t>
+      </w:r>
+      <w:proofErr w:type="spellEnd"/>
+    </w:p>
+    <w:p>
+      <w:pPr>
+        <w:spacing w:after="0" w:line="240" w:lineRule="auto"/>
+        <w:rPr>
+          <w:rFonts w:asciiTheme="majorHAnsi" w:hAnsiTheme="majorHAnsi"/>
+        </w:rPr>
+      </w:pPr>
+      <w:proofErr w:type="spellStart"/>
+      <w:r>
+        <w:rPr>
+          <w:rFonts w:asciiTheme="majorHAnsi" w:hAnsiTheme="majorHAnsi"/>
+        </w:rPr>
+        <w:t>truck_vin</w:t>
+      </w:r>
+      <w:proofErr w:type="spellEnd"/>
+      <w:r>
+        <w:rPr>
+          <w:rFonts w:asciiTheme="majorHAnsi" w:hAnsiTheme="majorHAnsi"/>
+        </w:rPr>
+        <w:t xml:space="preserve"> → </w:t>
+      </w:r>
+      <w:proofErr w:type="spellStart"/>
+      <w:r>
+        <w:rPr>
+          <w:rFonts w:asciiTheme="majorHAnsi" w:hAnsiTheme="majorHAnsi"/>
+        </w:rPr>
+        <w:t>truck_rego</w:t>
+      </w:r>
+      <w:proofErr w:type="spellEnd"/>
+      <w:r>
+        <w:rPr>
+          <w:rFonts w:asciiTheme="majorHAnsi" w:hAnsiTheme="majorHAnsi"/>
+        </w:rPr>
+        <w:t xml:space="preserve">, </w:t>
+      </w:r>
+      <w:proofErr w:type="spellStart"/>
+      <w:r>
+        <w:rPr>
+          <w:rFonts w:asciiTheme="majorHAnsi" w:hAnsiTheme="majorHAnsi"/>
+        </w:rPr>
+        <w:t>truck_make</w:t>
+      </w:r>
+      <w:proofErr w:type="spellEnd"/>
+      <w:r>
+        <w:rPr>
+          <w:rFonts w:asciiTheme="majorHAnsi" w:hAnsiTheme="majorHAnsi"/>
+        </w:rPr>
+        <w:t xml:space="preserve">, </w:t>
+      </w:r>
+      <w:proofErr w:type="spellStart"/>
+      <w:r>
+        <w:rPr>
+          <w:rFonts w:asciiTheme="majorHAnsi" w:hAnsiTheme="majorHAnsi"/>
+        </w:rPr>
+        <w:t>truck_model</w:t>
+      </w:r>
+      <w:proofErr w:type="spellEnd"/>
+      <w:r>
+        <w:rPr>
+          <w:rFonts w:asciiTheme="majorHAnsi" w:hAnsiTheme="majorHAnsi"/>
+        </w:rPr>
+        <w:t xml:space="preserve">, </w:t>
+      </w:r>
+      <w:proofErr w:type="spellStart"/>
+      <w:r>
+        <w:rPr>
+          <w:rFonts w:asciiTheme="majorHAnsi" w:hAnsiTheme="majorHAnsi"/>
+        </w:rPr>
+        <w:t>truck_year</w:t>
+      </w:r>
+      <w:proofErr w:type="spellEnd"/>
+    </w:p>
+    <w:p>
+      <w:pPr>
+        <w:spacing w:after="0" w:line="240" w:lineRule="auto"/>
+        <w:rPr>
+          <w:rFonts w:asciiTheme="majorHAnsi" w:hAnsiTheme="majorHAnsi"/>
+        </w:rPr>
+      </w:pPr>
+    </w:p>
+    <w:p>
+      <w:pPr>
+        <w:spacing w:after="0" w:line="240" w:lineRule="auto"/>
+        <w:rPr>
+          <w:rFonts w:asciiTheme="majorHAnsi" w:hAnsiTheme="majorHAnsi"/>
+        </w:rPr>
+      </w:pPr>
+    </w:p>
+    <w:p>
+      <w:pPr>
+        <w:spacing w:after="0" w:line="240" w:lineRule="auto"/>
+        <w:rPr>
+          <w:rFonts w:asciiTheme="majorHAnsi" w:hAnsiTheme="majorHAnsi"/>
+        </w:rPr>
+      </w:pPr>
+    </w:p>
+    <w:p>
+      <w:pPr>
+        <w:spacing w:after="0" w:line="240" w:lineRule="auto"/>
+        <w:rPr>
+          <w:rFonts w:asciiTheme="majorHAnsi" w:hAnsiTheme="majorHAnsi"/>
+          <w:b/>
+          <w:bCs/>
+          <w:sz w:val="26"/>
+          <w:szCs w:val="26"/>
+        </w:rPr>
+      </w:pPr>
+      <w:r>
+        <w:rPr>
+          <w:rFonts w:asciiTheme="majorHAnsi" w:hAnsiTheme="majorHAnsi"/>
+          <w:b/>
+          <w:bCs/>
+          <w:sz w:val="26"/>
+          <w:szCs w:val="26"/>
+        </w:rPr>
+        <w:t>3NF</w:t>
+      </w:r>
+    </w:p>
+    <w:p>
+      <w:pPr>
+        <w:spacing w:after="0" w:line="240" w:lineRule="auto"/>
+        <w:rPr>
+          <w:rFonts w:asciiTheme="majorHAnsi" w:hAnsiTheme="majorHAnsi"/>
+          <w:b/>
+          <w:bCs/>
+          <w:lang w:val="en-US"/>
+        </w:rPr>
+      </w:pPr>
+    </w:p>
+    <w:p>
+      <w:pPr>
+        <w:spacing w:after="0" w:line="240" w:lineRule="auto"/>
+        <w:rPr>
+          <w:rFonts w:asciiTheme="majorHAnsi" w:hAnsiTheme="majorHAnsi"/>
+          <w:lang w:val="en-US"/>
+        </w:rPr>
+      </w:pPr>
+      <w:r>
+        <w:rPr>
+          <w:rFonts w:asciiTheme="majorHAnsi" w:hAnsiTheme="majorHAnsi"/>
+          <w:lang w:val="en-US"/>
+        </w:rPr>
+        <w:t>CONTRACT_</w:t>
+      </w:r>
+      <w:r>
+        <w:rPr>
+          <w:rFonts w:asciiTheme="majorHAnsi" w:hAnsiTheme="majorHAnsi"/>
+          <w:lang w:val="en-US"/>
+        </w:rPr>
+        <w:t>WASTE (</w:t>
+      </w:r>
+      <w:r>
+        <w:rPr>
+          <w:rFonts w:asciiTheme="majorHAnsi" w:hAnsiTheme="majorHAnsi"/>
+          <w:u w:val="single"/>
+          <w:lang w:val="en-US"/>
+        </w:rPr>
+        <w:t>contract_no,</w:t>
+      </w:r>
+      <w:r>
+        <w:rPr>
+          <w:rFonts w:asciiTheme="majorHAnsi" w:hAnsiTheme="majorHAnsi"/>
+          <w:lang w:val="en-US"/>
+        </w:rPr>
+        <w:t xml:space="preserve"> waste_type_id, collection_frequency)</w:t>
+      </w:r>
+    </w:p>
+    <w:p>
+      <w:pPr>
+        <w:spacing w:after="0" w:line="240" w:lineRule="auto"/>
+        <w:rPr>
+          <w:rFonts w:asciiTheme="majorHAnsi" w:hAnsiTheme="majorHAnsi"/>
+          <w:lang w:val="en-US"/>
+        </w:rPr>
+      </w:pPr>
+      <w:r>
+        <w:rPr>
+          <w:rFonts w:asciiTheme="majorHAnsi" w:hAnsiTheme="majorHAnsi"/>
+          <w:b/>
+          <w:bCs/>
+          <w:lang w:val="en-US"/>
+        </w:rPr>
+        <w:t>CK</w:t>
+      </w:r>
+      <w:r>
+        <w:rPr>
+          <w:rFonts w:asciiTheme="majorHAnsi" w:hAnsiTheme="majorHAnsi"/>
+          <w:lang w:val="en-US"/>
+        </w:rPr>
+        <w:t>: contract_no</w:t>
+      </w:r>
+    </w:p>
+    <w:p>
+      <w:pPr>
+        <w:spacing w:after="0" w:line="240" w:lineRule="auto"/>
+        <w:rPr>
+          <w:rFonts w:asciiTheme="majorHAnsi" w:hAnsiTheme="majorHAnsi"/>
+          <w:lang w:val="en-US"/>
+        </w:rPr>
+      </w:pPr>
+    </w:p>
+    <w:p>
+      <w:pPr>
+        <w:spacing w:after="0" w:line="240" w:lineRule="auto"/>
+        <w:rPr>
+          <w:rFonts w:asciiTheme="majorHAnsi" w:hAnsiTheme="majorHAnsi"/>
+          <w:lang w:val="en-US"/>
+        </w:rPr>
+      </w:pPr>
+      <w:r>
+        <w:rPr>
+          <w:rFonts w:asciiTheme="majorHAnsi" w:hAnsiTheme="majorHAnsi"/>
+          <w:lang w:val="en-US"/>
+        </w:rPr>
+        <w:t>WASTE_</w:t>
+      </w:r>
+      <w:r>
+        <w:rPr>
+          <w:rFonts w:asciiTheme="majorHAnsi" w:hAnsiTheme="majorHAnsi"/>
+          <w:lang w:val="en-US"/>
+        </w:rPr>
+        <w:t>TYPE (</w:t>
+      </w:r>
+      <w:r>
+        <w:rPr>
+          <w:rFonts w:asciiTheme="majorHAnsi" w:hAnsiTheme="majorHAnsi"/>
+          <w:u w:val="single"/>
+          <w:lang w:val="en-US"/>
+        </w:rPr>
+        <w:t>waste_type_id</w:t>
+      </w:r>
+      <w:r>
+        <w:rPr>
+          <w:rFonts w:asciiTheme="majorHAnsi" w:hAnsiTheme="majorHAnsi"/>
+          <w:lang w:val="en-US"/>
+        </w:rPr>
+        <w:t>, waste_type_desc)</w:t>
+      </w:r>
+    </w:p>
+    <w:p>
+      <w:pPr>
+        <w:spacing w:after="0" w:line="240" w:lineRule="auto"/>
+        <w:rPr>
+          <w:rFonts w:asciiTheme="majorHAnsi" w:hAnsiTheme="majorHAnsi"/>
+          <w:lang w:val="en-US"/>
+        </w:rPr>
+      </w:pPr>
+      <w:r>
+        <w:rPr>
+          <w:rFonts w:asciiTheme="majorHAnsi" w:hAnsiTheme="majorHAnsi"/>
+          <w:b/>
+          <w:bCs/>
+          <w:lang w:val="en-US"/>
+        </w:rPr>
+        <w:t>CK</w:t>
+      </w:r>
+      <w:r>
+        <w:rPr>
+          <w:rFonts w:asciiTheme="majorHAnsi" w:hAnsiTheme="majorHAnsi"/>
+          <w:lang w:val="en-US"/>
+        </w:rPr>
+        <w:t>: waste_type_id</w:t>
+      </w:r>
+    </w:p>
+    <w:p>
+      <w:pPr>
+        <w:spacing w:after="0" w:line="240" w:lineRule="auto"/>
+        <w:rPr>
+          <w:rFonts w:asciiTheme="majorHAnsi" w:hAnsiTheme="majorHAnsi"/>
+          <w:lang w:val="en-US"/>
+        </w:rPr>
+      </w:pPr>
+    </w:p>
+    <w:p>
+      <w:pPr>
+        <w:spacing w:after="0" w:line="240" w:lineRule="auto"/>
+        <w:rPr>
+          <w:rFonts w:asciiTheme="majorHAnsi" w:hAnsiTheme="majorHAnsi"/>
+          <w:lang w:val="en-US"/>
+        </w:rPr>
+      </w:pPr>
+      <w:r>
+        <w:rPr>
+          <w:rFonts w:asciiTheme="majorHAnsi" w:hAnsiTheme="majorHAnsi"/>
+          <w:lang w:val="en-US"/>
+        </w:rPr>
+        <w:t>COLLECTION (</w:t>
+      </w:r>
+      <w:r>
+        <w:rPr>
+          <w:rFonts w:asciiTheme="majorHAnsi" w:hAnsiTheme="majorHAnsi"/>
+          <w:u w:val="single"/>
+          <w:lang w:val="en-US"/>
+        </w:rPr>
+        <w:t>contract_no</w:t>
+      </w:r>
+      <w:r>
+        <w:rPr>
+          <w:rFonts w:asciiTheme="majorHAnsi" w:hAnsiTheme="majorHAnsi"/>
+          <w:lang w:val="en-US"/>
+        </w:rPr>
+        <w:t xml:space="preserve">, </w:t>
+      </w:r>
+      <w:r>
+        <w:rPr>
+          <w:rFonts w:asciiTheme="majorHAnsi" w:hAnsiTheme="majorHAnsi"/>
+          <w:u w:val="single"/>
+          <w:lang w:val="en-US"/>
+        </w:rPr>
+        <w:t>collect_date</w:t>
+      </w:r>
+      <w:r>
+        <w:rPr>
+          <w:rFonts w:asciiTheme="majorHAnsi" w:hAnsiTheme="majorHAnsi"/>
+          <w:lang w:val="en-US"/>
+        </w:rPr>
+        <w:t>, truck_vin)</w:t>
+      </w:r>
+    </w:p>
+    <w:p>
+      <w:pPr>
+        <w:spacing w:after="0" w:line="240" w:lineRule="auto"/>
+        <w:rPr>
+          <w:rFonts w:asciiTheme="majorHAnsi" w:hAnsiTheme="majorHAnsi"/>
+          <w:lang w:val="en-US"/>
+        </w:rPr>
+      </w:pPr>
+      <w:r>
+        <w:rPr>
+          <w:rFonts w:asciiTheme="majorHAnsi" w:hAnsiTheme="majorHAnsi"/>
+          <w:b/>
+          <w:bCs/>
+          <w:lang w:val="en-US"/>
+        </w:rPr>
+        <w:t>CK:</w:t>
+      </w:r>
+      <w:r>
+        <w:rPr>
+          <w:rFonts w:asciiTheme="majorHAnsi" w:hAnsiTheme="majorHAnsi"/>
+          <w:lang w:val="en-US"/>
+        </w:rPr>
+        <w:t xml:space="preserve"> contract_no, collect_date</w:t>
+      </w:r>
+    </w:p>
+    <w:p>
+      <w:pPr>
+        <w:spacing w:after="0" w:line="240" w:lineRule="auto"/>
+        <w:rPr>
+          <w:rFonts w:asciiTheme="majorHAnsi" w:hAnsiTheme="majorHAnsi"/>
+          <w:lang w:val="en-US"/>
+        </w:rPr>
+      </w:pPr>
+      <w:r>
+        <w:rPr>
+          <w:rFonts w:asciiTheme="majorHAnsi" w:hAnsiTheme="majorHAnsi"/>
+          <w:b/>
+          <w:bCs/>
+          <w:lang w:val="en-US"/>
+        </w:rPr>
+        <w:t>CK:</w:t>
+      </w:r>
+      <w:r>
+        <w:rPr>
+          <w:rFonts w:asciiTheme="majorHAnsi" w:hAnsiTheme="majorHAnsi"/>
+          <w:lang w:val="en-US"/>
+        </w:rPr>
+        <w:t xml:space="preserve"> truck_vin, collect_date</w:t>
+      </w:r>
+    </w:p>
+    <w:p>
+      <w:pPr>
+        <w:spacing w:after="0" w:line="240" w:lineRule="auto"/>
+        <w:rPr>
+          <w:rFonts w:asciiTheme="majorHAnsi" w:hAnsiTheme="majorHAnsi"/>
+          <w:lang w:val="en-US"/>
+        </w:rPr>
+      </w:pPr>
+    </w:p>
+    <w:p>
+      <w:pPr>
+        <w:spacing w:after="0" w:line="240" w:lineRule="auto"/>
+        <w:rPr>
+          <w:rFonts w:asciiTheme="majorHAnsi" w:hAnsiTheme="majorHAnsi"/>
+          <w:lang w:val="en-US"/>
+        </w:rPr>
+      </w:pPr>
+      <w:r>
+        <w:rPr>
+          <w:rFonts w:asciiTheme="majorHAnsi" w:hAnsiTheme="majorHAnsi"/>
+          <w:lang w:val="en-US"/>
+        </w:rPr>
+        <w:t>TRUCK (</w:t>
+      </w:r>
+      <w:r>
+        <w:rPr>
+          <w:rFonts w:asciiTheme="majorHAnsi" w:hAnsiTheme="majorHAnsi"/>
+          <w:u w:val="single"/>
+          <w:lang w:val="en-US"/>
+        </w:rPr>
+        <w:t>truck_vin</w:t>
+      </w:r>
+      <w:r>
+        <w:rPr>
+          <w:rFonts w:asciiTheme="majorHAnsi" w:hAnsiTheme="majorHAnsi"/>
+          <w:lang w:val="en-US"/>
+        </w:rPr>
+        <w:t xml:space="preserve">, truck_rego, </w:t>
+      </w:r>
+      <w:proofErr w:type="spellStart"/>
+      <w:r>
+        <w:rPr>
+          <w:rFonts w:asciiTheme="majorHAnsi" w:hAnsiTheme="majorHAnsi"/>
+          <w:lang w:val="en-US"/>
+        </w:rPr>
+        <w:t>truck_make</w:t>
+      </w:r>
+      <w:proofErr w:type="spellEnd"/>
+      <w:r>
+        <w:rPr>
+          <w:rFonts w:asciiTheme="majorHAnsi" w:hAnsiTheme="majorHAnsi"/>
+          <w:lang w:val="en-US"/>
+        </w:rPr>
+        <w:t xml:space="preserve">, </w:t>
+      </w:r>
+      <w:proofErr w:type="spellStart"/>
+      <w:r>
+        <w:rPr>
+          <w:rFonts w:asciiTheme="majorHAnsi" w:hAnsiTheme="majorHAnsi"/>
+          <w:lang w:val="en-US"/>
+        </w:rPr>
+        <w:t>truck_model</w:t>
+      </w:r>
+      <w:proofErr w:type="spellEnd"/>
+      <w:r>
+        <w:rPr>
+          <w:rFonts w:asciiTheme="majorHAnsi" w:hAnsiTheme="majorHAnsi"/>
+          <w:lang w:val="en-US"/>
+        </w:rPr>
+        <w:t xml:space="preserve">, </w:t>
+      </w:r>
+      <w:proofErr w:type="spellStart"/>
+      <w:r>
+        <w:rPr>
+          <w:rFonts w:asciiTheme="majorHAnsi" w:hAnsiTheme="majorHAnsi"/>
+          <w:lang w:val="en-US"/>
+        </w:rPr>
+        <w:t>truck_year</w:t>
+      </w:r>
+      <w:proofErr w:type="spellEnd"/>
+      <w:r>
+        <w:rPr>
+          <w:rFonts w:asciiTheme="majorHAnsi" w:hAnsiTheme="majorHAnsi"/>
+          <w:lang w:val="en-US"/>
+        </w:rPr>
+        <w:t>)</w:t>
+      </w:r>
+    </w:p>
+    <w:p>
+      <w:pPr>
+        <w:spacing w:after="0" w:line="240" w:lineRule="auto"/>
+        <w:rPr>
+          <w:rFonts w:asciiTheme="majorHAnsi" w:hAnsiTheme="majorHAnsi"/>
+          <w:lang w:val="en-US"/>
+        </w:rPr>
+      </w:pPr>
+      <w:r>
+        <w:rPr>
+          <w:rFonts w:asciiTheme="majorHAnsi" w:hAnsiTheme="majorHAnsi"/>
+          <w:b/>
+          <w:bCs/>
+          <w:lang w:val="en-US"/>
+        </w:rPr>
+        <w:t>CK</w:t>
+      </w:r>
+      <w:r>
+        <w:rPr>
+          <w:rFonts w:asciiTheme="majorHAnsi" w:hAnsiTheme="majorHAnsi"/>
+          <w:lang w:val="en-US"/>
+        </w:rPr>
+        <w:t>: truck_vin</w:t>
+      </w:r>
+    </w:p>
+    <w:p>
+      <w:pPr>
+        <w:spacing w:after="0" w:line="240" w:lineRule="auto"/>
+        <w:rPr>
+          <w:rFonts w:asciiTheme="majorHAnsi" w:hAnsiTheme="majorHAnsi"/>
+          <w:lang w:val="en-US"/>
+        </w:rPr>
+      </w:pPr>
+      <w:r>
+        <w:rPr>
+          <w:rFonts w:asciiTheme="majorHAnsi" w:hAnsiTheme="majorHAnsi"/>
+          <w:b/>
+          <w:bCs/>
+          <w:lang w:val="en-US"/>
+        </w:rPr>
+        <w:t>CK:</w:t>
+      </w:r>
+      <w:r>
+        <w:rPr>
+          <w:rFonts w:asciiTheme="majorHAnsi" w:hAnsiTheme="majorHAnsi"/>
+          <w:lang w:val="en-US"/>
+        </w:rPr>
+        <w:t xml:space="preserve"> truck_rego</w:t>
+      </w:r>
+    </w:p>
+    <w:p>
+      <w:pPr>
+        <w:spacing w:after="0" w:line="240" w:lineRule="auto"/>
+        <w:rPr>
+          <w:rFonts w:asciiTheme="majorHAnsi" w:hAnsiTheme="majorHAnsi"/>
+          <w:lang w:val="en-US"/>
+        </w:rPr>
+      </w:pPr>
+    </w:p>
+    <w:p>
+      <w:pPr>
+        <w:spacing w:after="0" w:line="240" w:lineRule="auto"/>
+        <w:rPr>
+          <w:rFonts w:asciiTheme="majorHAnsi" w:hAnsiTheme="majorHAnsi"/>
+          <w:lang w:val="en-US"/>
+        </w:rPr>
+      </w:pPr>
+      <w:r>
+        <w:rPr>
+          <w:rFonts w:asciiTheme="majorHAnsi" w:hAnsiTheme="majorHAnsi"/>
+          <w:lang w:val="en-US"/>
+        </w:rPr>
+        <w:t>BIN_</w:t>
+      </w:r>
+      <w:r>
+        <w:rPr>
+          <w:rFonts w:asciiTheme="majorHAnsi" w:hAnsiTheme="majorHAnsi"/>
+          <w:lang w:val="en-US"/>
+        </w:rPr>
+        <w:t>COLLECTION (</w:t>
+      </w:r>
+      <w:r>
+        <w:rPr>
+          <w:rFonts w:asciiTheme="majorHAnsi" w:hAnsiTheme="majorHAnsi"/>
+          <w:u w:val="single"/>
+          <w:lang w:val="en-US"/>
+        </w:rPr>
+        <w:t>contract_no,</w:t>
+      </w:r>
+      <w:r>
+        <w:rPr>
+          <w:rFonts w:asciiTheme="majorHAnsi" w:hAnsiTheme="majorHAnsi"/>
+          <w:lang w:val="en-US"/>
+        </w:rPr>
+        <w:t xml:space="preserve"> </w:t>
+      </w:r>
+      <w:r>
+        <w:rPr>
+          <w:rFonts w:asciiTheme="majorHAnsi" w:hAnsiTheme="majorHAnsi"/>
+          <w:u w:val="single"/>
+          <w:lang w:val="en-US"/>
+        </w:rPr>
+        <w:t>collect_date,</w:t>
+      </w:r>
+      <w:r>
+        <w:rPr>
+          <w:rFonts w:asciiTheme="majorHAnsi" w:hAnsiTheme="majorHAnsi"/>
+          <w:lang w:val="en-US"/>
+        </w:rPr>
+        <w:t xml:space="preserve"> </w:t>
+      </w:r>
+      <w:r>
+        <w:rPr>
+          <w:rFonts w:asciiTheme="majorHAnsi" w:hAnsiTheme="majorHAnsi"/>
+          <w:u w:val="single"/>
+          <w:lang w:val="en-US"/>
+        </w:rPr>
+        <w:t>bin_rfid</w:t>
+      </w:r>
+      <w:r>
+        <w:rPr>
+          <w:rFonts w:asciiTheme="majorHAnsi" w:hAnsiTheme="majorHAnsi"/>
+          <w:lang w:val="en-US"/>
+        </w:rPr>
+        <w:t>, collected_kgs, overweight)</w:t>
+      </w:r>
+    </w:p>
+    <w:p>
+      <w:pPr>
+        <w:spacing w:after="0" w:line="240" w:lineRule="auto"/>
+        <w:rPr>
+          <w:rFonts w:asciiTheme="majorHAnsi" w:hAnsiTheme="majorHAnsi"/>
+          <w:lang w:val="en-US"/>
+        </w:rPr>
+      </w:pPr>
+      <w:r>
+        <w:rPr>
+          <w:rFonts w:asciiTheme="majorHAnsi" w:hAnsiTheme="majorHAnsi"/>
+          <w:b/>
+          <w:bCs/>
+          <w:lang w:val="en-US"/>
+        </w:rPr>
+        <w:t>CK:</w:t>
+      </w:r>
+      <w:r>
+        <w:rPr>
+          <w:rFonts w:asciiTheme="majorHAnsi" w:hAnsiTheme="majorHAnsi"/>
+          <w:lang w:val="en-US"/>
+        </w:rPr>
+        <w:t xml:space="preserve"> contract_no, collect_date, bin_rfid</w:t>
       </w:r>
     </w:p>
     <w:sectPr>
@@ -201,6 +1910,279 @@
     </w:sectPr>
   </w:body>
 </w:document>
+</file>
+
+<file path=word/numbering.xml><?xml version="1.0" encoding="utf-8"?>
+<w:numbering xmlns:wpc="http://schemas.microsoft.com/office/word/2010/wordprocessingCanvas" xmlns:cx="http://schemas.microsoft.com/office/drawing/2014/chartex" xmlns:cx1="http://schemas.microsoft.com/office/drawing/2015/9/8/chartex" xmlns:cx2="http://schemas.microsoft.com/office/drawing/2015/10/21/chartex" xmlns:cx3="http://schemas.microsoft.com/office/drawing/2016/5/9/chartex" xmlns:cx4="http://schemas.microsoft.com/office/drawing/2016/5/10/chartex" xmlns:cx5="http://schemas.microsoft.com/office/drawing/2016/5/11/chartex" xmlns:cx6="http://schemas.microsoft.com/office/drawing/2016/5/12/chartex" xmlns:cx7="http://schemas.microsoft.com/office/drawing/2016/5/13/chartex" xmlns:cx8="http://schemas.microsoft.com/office/drawing/2016/5/14/chartex" xmlns:mc="http://schemas.openxmlformats.org/markup-compatibility/2006" xmlns:aink="http://schemas.microsoft.com/office/drawing/2016/ink" xmlns:am3d="http://schemas.microsoft.com/office/drawing/2017/model3d" xmlns:o="urn:schemas-microsoft-com:office:office" xmlns:oel="http://schemas.microsoft.com/office/2019/extlst" xmlns:r="http://schemas.openxmlformats.org/officeDocument/2006/relationships" xmlns:m="http://schemas.openxmlformats.org/officeDocument/2006/math" xmlns:v="urn:schemas-microsoft-com:vml" xmlns:wp14="http://schemas.microsoft.com/office/word/2010/wordprocessingDrawing" xmlns:wp="http://schemas.openxmlformats.org/drawingml/2006/wordprocessingDrawing" xmlns:w10="urn:schemas-microsoft-com:office:word" xmlns:w="http://schemas.openxmlformats.org/wordprocessingml/2006/main" xmlns:w14="http://schemas.microsoft.com/office/word/2010/wordml" xmlns:w15="http://schemas.microsoft.com/office/word/2012/wordml" xmlns:w16cex="http://schemas.microsoft.com/office/word/2018/wordml/cex" xmlns:w16cid="http://schemas.microsoft.com/office/word/2016/wordml/cid" xmlns:w16="http://schemas.microsoft.com/office/word/2018/wordml" xmlns:w16du="http://schemas.microsoft.com/office/word/2023/wordml/word16du" xmlns:w16sdtdh="http://schemas.microsoft.com/office/word/2020/wordml/sdtdatahash" xmlns:w16sdtfl="http://schemas.microsoft.com/office/word/2024/wordml/sdtformatlock" xmlns:w16se="http://schemas.microsoft.com/office/word/2015/wordml/symex" xmlns:wpg="http://schemas.microsoft.com/office/word/2010/wordprocessingGroup" xmlns:wpi="http://schemas.microsoft.com/office/word/2010/wordprocessingInk" xmlns:wne="http://schemas.microsoft.com/office/word/2006/wordml" xmlns:wps="http://schemas.microsoft.com/office/word/2010/wordprocessingShape" mc:Ignorable="w14 w15 w16se w16cid w16 w16cex w16sdtdh w16sdtfl w16du wp14">
+  <w:abstractNum w:abstractNumId="0" w15:restartNumberingAfterBreak="0">
+    <w:nsid w:val="54383753"/>
+    <w:multiLevelType w:val="multilevel"/>
+    <w:tmpl w:val="753C0CE2"/>
+    <w:lvl w:ilvl="0">
+      <w:start w:val="1"/>
+      <w:numFmt w:val="bullet"/>
+      <w:lvlText w:val=""/>
+      <w:lvlJc w:val="left"/>
+      <w:pPr>
+        <w:tabs>
+          <w:tab w:val="num" w:pos="720"/>
+        </w:tabs>
+        <w:ind w:left="720" w:hanging="360"/>
+      </w:pPr>
+      <w:rPr>
+        <w:rFonts w:ascii="Symbol" w:hAnsi="Symbol" w:hint="default"/>
+        <w:sz w:val="20"/>
+      </w:rPr>
+    </w:lvl>
+    <w:lvl w:ilvl="1" w:tentative="1">
+      <w:start w:val="1"/>
+      <w:numFmt w:val="bullet"/>
+      <w:lvlText w:val="o"/>
+      <w:lvlJc w:val="left"/>
+      <w:pPr>
+        <w:tabs>
+          <w:tab w:val="num" w:pos="1440"/>
+        </w:tabs>
+        <w:ind w:left="1440" w:hanging="360"/>
+      </w:pPr>
+      <w:rPr>
+        <w:rFonts w:ascii="Courier New" w:hAnsi="Courier New" w:hint="default"/>
+        <w:sz w:val="20"/>
+      </w:rPr>
+    </w:lvl>
+    <w:lvl w:ilvl="2" w:tentative="1">
+      <w:start w:val="1"/>
+      <w:numFmt w:val="bullet"/>
+      <w:lvlText w:val=""/>
+      <w:lvlJc w:val="left"/>
+      <w:pPr>
+        <w:tabs>
+          <w:tab w:val="num" w:pos="2160"/>
+        </w:tabs>
+        <w:ind w:left="2160" w:hanging="360"/>
+      </w:pPr>
+      <w:rPr>
+        <w:rFonts w:ascii="Wingdings" w:hAnsi="Wingdings" w:hint="default"/>
+        <w:sz w:val="20"/>
+      </w:rPr>
+    </w:lvl>
+    <w:lvl w:ilvl="3" w:tentative="1">
+      <w:start w:val="1"/>
+      <w:numFmt w:val="bullet"/>
+      <w:lvlText w:val=""/>
+      <w:lvlJc w:val="left"/>
+      <w:pPr>
+        <w:tabs>
+          <w:tab w:val="num" w:pos="2880"/>
+        </w:tabs>
+        <w:ind w:left="2880" w:hanging="360"/>
+      </w:pPr>
+      <w:rPr>
+        <w:rFonts w:ascii="Wingdings" w:hAnsi="Wingdings" w:hint="default"/>
+        <w:sz w:val="20"/>
+      </w:rPr>
+    </w:lvl>
+    <w:lvl w:ilvl="4" w:tentative="1">
+      <w:start w:val="1"/>
+      <w:numFmt w:val="bullet"/>
+      <w:lvlText w:val=""/>
+      <w:lvlJc w:val="left"/>
+      <w:pPr>
+        <w:tabs>
+          <w:tab w:val="num" w:pos="3600"/>
+        </w:tabs>
+        <w:ind w:left="3600" w:hanging="360"/>
+      </w:pPr>
+      <w:rPr>
+        <w:rFonts w:ascii="Wingdings" w:hAnsi="Wingdings" w:hint="default"/>
+        <w:sz w:val="20"/>
+      </w:rPr>
+    </w:lvl>
+    <w:lvl w:ilvl="5" w:tentative="1">
+      <w:start w:val="1"/>
+      <w:numFmt w:val="bullet"/>
+      <w:lvlText w:val=""/>
+      <w:lvlJc w:val="left"/>
+      <w:pPr>
+        <w:tabs>
+          <w:tab w:val="num" w:pos="4320"/>
+        </w:tabs>
+        <w:ind w:left="4320" w:hanging="360"/>
+      </w:pPr>
+      <w:rPr>
+        <w:rFonts w:ascii="Wingdings" w:hAnsi="Wingdings" w:hint="default"/>
+        <w:sz w:val="20"/>
+      </w:rPr>
+    </w:lvl>
+    <w:lvl w:ilvl="6" w:tentative="1">
+      <w:start w:val="1"/>
+      <w:numFmt w:val="bullet"/>
+      <w:lvlText w:val=""/>
+      <w:lvlJc w:val="left"/>
+      <w:pPr>
+        <w:tabs>
+          <w:tab w:val="num" w:pos="5040"/>
+        </w:tabs>
+        <w:ind w:left="5040" w:hanging="360"/>
+      </w:pPr>
+      <w:rPr>
+        <w:rFonts w:ascii="Wingdings" w:hAnsi="Wingdings" w:hint="default"/>
+        <w:sz w:val="20"/>
+      </w:rPr>
+    </w:lvl>
+    <w:lvl w:ilvl="7" w:tentative="1">
+      <w:start w:val="1"/>
+      <w:numFmt w:val="bullet"/>
+      <w:lvlText w:val=""/>
+      <w:lvlJc w:val="left"/>
+      <w:pPr>
+        <w:tabs>
+          <w:tab w:val="num" w:pos="5760"/>
+        </w:tabs>
+        <w:ind w:left="5760" w:hanging="360"/>
+      </w:pPr>
+      <w:rPr>
+        <w:rFonts w:ascii="Wingdings" w:hAnsi="Wingdings" w:hint="default"/>
+        <w:sz w:val="20"/>
+      </w:rPr>
+    </w:lvl>
+    <w:lvl w:ilvl="8" w:tentative="1">
+      <w:start w:val="1"/>
+      <w:numFmt w:val="bullet"/>
+      <w:lvlText w:val=""/>
+      <w:lvlJc w:val="left"/>
+      <w:pPr>
+        <w:tabs>
+          <w:tab w:val="num" w:pos="6480"/>
+        </w:tabs>
+        <w:ind w:left="6480" w:hanging="360"/>
+      </w:pPr>
+      <w:rPr>
+        <w:rFonts w:ascii="Wingdings" w:hAnsi="Wingdings" w:hint="default"/>
+        <w:sz w:val="20"/>
+      </w:rPr>
+    </w:lvl>
+  </w:abstractNum>
+  <w:abstractNum w:abstractNumId="1" w15:restartNumberingAfterBreak="0">
+    <w:nsid w:val="79B7464B"/>
+    <w:multiLevelType w:val="hybridMultilevel"/>
+    <w:tmpl w:val="FCD40CCE"/>
+    <w:lvl w:ilvl="0" w:tplc="08090001">
+      <w:start w:val="1"/>
+      <w:numFmt w:val="bullet"/>
+      <w:lvlText w:val=""/>
+      <w:lvlJc w:val="left"/>
+      <w:pPr>
+        <w:ind w:left="764" w:hanging="360"/>
+      </w:pPr>
+      <w:rPr>
+        <w:rFonts w:ascii="Symbol" w:hAnsi="Symbol" w:hint="default"/>
+      </w:rPr>
+    </w:lvl>
+    <w:lvl w:ilvl="1" w:tplc="08090003" w:tentative="1">
+      <w:start w:val="1"/>
+      <w:numFmt w:val="bullet"/>
+      <w:lvlText w:val="o"/>
+      <w:lvlJc w:val="left"/>
+      <w:pPr>
+        <w:ind w:left="1484" w:hanging="360"/>
+      </w:pPr>
+      <w:rPr>
+        <w:rFonts w:ascii="Courier New" w:hAnsi="Courier New" w:cs="Courier New" w:hint="default"/>
+      </w:rPr>
+    </w:lvl>
+    <w:lvl w:ilvl="2" w:tplc="08090005" w:tentative="1">
+      <w:start w:val="1"/>
+      <w:numFmt w:val="bullet"/>
+      <w:lvlText w:val=""/>
+      <w:lvlJc w:val="left"/>
+      <w:pPr>
+        <w:ind w:left="2204" w:hanging="360"/>
+      </w:pPr>
+      <w:rPr>
+        <w:rFonts w:ascii="Wingdings" w:hAnsi="Wingdings" w:hint="default"/>
+      </w:rPr>
+    </w:lvl>
+    <w:lvl w:ilvl="3" w:tplc="08090001" w:tentative="1">
+      <w:start w:val="1"/>
+      <w:numFmt w:val="bullet"/>
+      <w:lvlText w:val=""/>
+      <w:lvlJc w:val="left"/>
+      <w:pPr>
+        <w:ind w:left="2924" w:hanging="360"/>
+      </w:pPr>
+      <w:rPr>
+        <w:rFonts w:ascii="Symbol" w:hAnsi="Symbol" w:hint="default"/>
+      </w:rPr>
+    </w:lvl>
+    <w:lvl w:ilvl="4" w:tplc="08090003" w:tentative="1">
+      <w:start w:val="1"/>
+      <w:numFmt w:val="bullet"/>
+      <w:lvlText w:val="o"/>
+      <w:lvlJc w:val="left"/>
+      <w:pPr>
+        <w:ind w:left="3644" w:hanging="360"/>
+      </w:pPr>
+      <w:rPr>
+        <w:rFonts w:ascii="Courier New" w:hAnsi="Courier New" w:cs="Courier New" w:hint="default"/>
+      </w:rPr>
+    </w:lvl>
+    <w:lvl w:ilvl="5" w:tplc="08090005" w:tentative="1">
+      <w:start w:val="1"/>
+      <w:numFmt w:val="bullet"/>
+      <w:lvlText w:val=""/>
+      <w:lvlJc w:val="left"/>
+      <w:pPr>
+        <w:ind w:left="4364" w:hanging="360"/>
+      </w:pPr>
+      <w:rPr>
+        <w:rFonts w:ascii="Wingdings" w:hAnsi="Wingdings" w:hint="default"/>
+      </w:rPr>
+    </w:lvl>
+    <w:lvl w:ilvl="6" w:tplc="08090001" w:tentative="1">
+      <w:start w:val="1"/>
+      <w:numFmt w:val="bullet"/>
+      <w:lvlText w:val=""/>
+      <w:lvlJc w:val="left"/>
+      <w:pPr>
+        <w:ind w:left="5084" w:hanging="360"/>
+      </w:pPr>
+      <w:rPr>
+        <w:rFonts w:ascii="Symbol" w:hAnsi="Symbol" w:hint="default"/>
+      </w:rPr>
+    </w:lvl>
+    <w:lvl w:ilvl="7" w:tplc="08090003" w:tentative="1">
+      <w:start w:val="1"/>
+      <w:numFmt w:val="bullet"/>
+      <w:lvlText w:val="o"/>
+      <w:lvlJc w:val="left"/>
+      <w:pPr>
+        <w:ind w:left="5804" w:hanging="360"/>
+      </w:pPr>
+      <w:rPr>
+        <w:rFonts w:ascii="Courier New" w:hAnsi="Courier New" w:cs="Courier New" w:hint="default"/>
+      </w:rPr>
+    </w:lvl>
+    <w:lvl w:ilvl="8" w:tplc="08090005" w:tentative="1">
+      <w:start w:val="1"/>
+      <w:numFmt w:val="bullet"/>
+      <w:lvlText w:val=""/>
+      <w:lvlJc w:val="left"/>
+      <w:pPr>
+        <w:ind w:left="6524" w:hanging="360"/>
+      </w:pPr>
+      <w:rPr>
+        <w:rFonts w:ascii="Wingdings" w:hAnsi="Wingdings" w:hint="default"/>
+      </w:rPr>
+    </w:lvl>
+  </w:abstractNum>
+  <w:num w:numId="1" w16cid:durableId="1283222084">
+    <w:abstractNumId w:val="0"/>
+  </w:num>
+  <w:num w:numId="2" w16cid:durableId="1748720355">
+    <w:abstractNumId w:val="1"/>
+  </w:num>
+</w:numbering>
 </file>
 
 <file path=word/styles.xml><?xml version="1.0" encoding="utf-8"?>
@@ -1120,6 +3102,45 @@
       <w:spacing w:val="5"/>
     </w:rPr>
   </w:style>
+  <w:style w:type="paragraph" w:customStyle="1" w:styleId="font-claude-response-body">
+    <w:name w:val="font-claude-response-body"/>
+    <w:basedOn w:val="Normal"/>
+    <w:rsid w:val="0088252F"/>
+    <w:pPr>
+      <w:spacing w:before="100" w:beforeAutospacing="1" w:after="100" w:afterAutospacing="1" w:line="240" w:lineRule="auto"/>
+    </w:pPr>
+    <w:rPr>
+      <w:rFonts w:ascii="Times New Roman" w:eastAsia="Times New Roman" w:hAnsi="Times New Roman" w:cs="Times New Roman"/>
+      <w:kern w:val="0"/>
+      <w:lang w:eastAsia="en-GB"/>
+      <w14:ligatures w14:val="none"/>
+    </w:rPr>
+  </w:style>
+  <w:style w:type="character" w:styleId="Strong">
+    <w:name w:val="Strong"/>
+    <w:basedOn w:val="DefaultParagraphFont"/>
+    <w:uiPriority w:val="22"/>
+    <w:qFormat/>
+    <w:rsid w:val="0088252F"/>
+    <w:rPr>
+      <w:b/>
+      <w:bCs/>
+    </w:rPr>
+  </w:style>
+  <w:style w:type="paragraph" w:customStyle="1" w:styleId="whitespace-normal">
+    <w:name w:val="whitespace-normal"/>
+    <w:basedOn w:val="Normal"/>
+    <w:rsid w:val="0088252F"/>
+    <w:pPr>
+      <w:spacing w:before="100" w:beforeAutospacing="1" w:after="100" w:afterAutospacing="1" w:line="240" w:lineRule="auto"/>
+    </w:pPr>
+    <w:rPr>
+      <w:rFonts w:ascii="Times New Roman" w:eastAsia="Times New Roman" w:hAnsi="Times New Roman" w:cs="Times New Roman"/>
+      <w:kern w:val="0"/>
+      <w:lang w:eastAsia="en-GB"/>
+      <w14:ligatures w14:val="none"/>
+    </w:rPr>
+  </w:style>
 </w:styles>
 </file>
 

</xml_diff>

<commit_message>
Final normalisation - integrated relations checked against conceptual model
</commit_message>
<xml_diff>
--- a/Assignments/Ass1/ca_normalisation.docx
+++ b/Assignments/Ass1/ca_normalisation.docx
@@ -1900,6 +1900,100 @@
           <w:lang w:val="en-US"/>
         </w:rPr>
         <w:t xml:space="preserve"> contract_no, collect_date, bin_rfid</w:t>
+      </w:r>
+    </w:p>
+    <w:p>
+      <w:pPr>
+        <w:spacing w:after="0" w:line="240" w:lineRule="auto"/>
+        <w:rPr>
+          <w:rFonts w:asciiTheme="majorHAnsi" w:hAnsiTheme="majorHAnsi"/>
+          <w:lang w:val="en-US"/>
+        </w:rPr>
+      </w:pPr>
+    </w:p>
+    <w:p>
+      <w:pPr>
+        <w:spacing w:after="0" w:line="240" w:lineRule="auto"/>
+        <w:rPr>
+          <w:rFonts w:asciiTheme="majorHAnsi" w:hAnsiTheme="majorHAnsi"/>
+          <w:lang w:val="en-US"/>
+        </w:rPr>
+      </w:pPr>
+    </w:p>
+    <w:p>
+      <w:pPr>
+        <w:spacing w:after="0" w:line="240" w:lineRule="auto"/>
+        <w:rPr>
+          <w:rFonts w:asciiTheme="majorHAnsi" w:hAnsiTheme="majorHAnsi"/>
+          <w:b/>
+          <w:bCs/>
+          <w:sz w:val="26"/>
+          <w:szCs w:val="26"/>
+          <w:lang w:val="en-US"/>
+        </w:rPr>
+      </w:pPr>
+    </w:p>
+    <w:p>
+      <w:pPr>
+        <w:spacing w:after="0" w:line="240" w:lineRule="auto"/>
+        <w:rPr>
+          <w:rFonts w:asciiTheme="majorHAnsi" w:hAnsiTheme="majorHAnsi"/>
+          <w:b/>
+          <w:bCs/>
+          <w:sz w:val="26"/>
+          <w:szCs w:val="26"/>
+          <w:lang w:val="en-US"/>
+        </w:rPr>
+      </w:pPr>
+      <w:r>
+        <w:rPr>
+          <w:rFonts w:asciiTheme="majorHAnsi" w:hAnsiTheme="majorHAnsi"/>
+          <w:b/>
+          <w:bCs/>
+          <w:sz w:val="26"/>
+          <w:szCs w:val="26"/>
+          <w:lang w:val="en-US"/>
+        </w:rPr>
+        <w:t>Attribute Synthesis:</w:t>
+      </w:r>
+    </w:p>
+    <w:p>
+      <w:pPr>
+        <w:spacing w:after="0" w:line="240" w:lineRule="auto"/>
+        <w:rPr>
+          <w:rFonts w:asciiTheme="majorHAnsi" w:hAnsiTheme="majorHAnsi"/>
+          <w:lang w:val="en-US"/>
+        </w:rPr>
+      </w:pPr>
+    </w:p>
+    <w:p>
+      <w:pPr>
+        <w:spacing w:after="0" w:line="240" w:lineRule="auto"/>
+        <w:rPr>
+          <w:rFonts w:asciiTheme="majorHAnsi" w:hAnsiTheme="majorHAnsi"/>
+          <w:lang w:val="en-US"/>
+        </w:rPr>
+      </w:pPr>
+      <w:r>
+        <w:rPr>
+          <w:rFonts w:asciiTheme="majorHAnsi" w:hAnsiTheme="majorHAnsi"/>
+          <w:lang w:val="en-US"/>
+        </w:rPr>
+        <w:t xml:space="preserve">No synthesis required </w:t>
+      </w:r>
+      <w:r>
+        <w:rPr>
+          <w:rFonts w:asciiTheme="majorHAnsi" w:hAnsiTheme="majorHAnsi"/>
+          <w:lang w:val="en-US"/>
+        </w:rPr>
+        <w:t xml:space="preserve">, </w:t>
+      </w:r>
+      <w:r>
+        <w:rPr>
+          <w:rFonts w:asciiTheme="majorHAnsi" w:hAnsiTheme="majorHAnsi"/>
+          <w:lang w:val="en-US"/>
+        </w:rPr>
+        <w:t>no duplicate relation structures identified.</w:t>
       </w:r>
     </w:p>
     <w:sectPr>

</xml_diff>

<commit_message>
Corrected partial dependencies in 1NF
</commit_message>
<xml_diff>
--- a/Assignments/Ass1/ca_normalisation.docx
+++ b/Assignments/Ass1/ca_normalisation.docx
@@ -72,21 +72,7 @@
           <w:rFonts w:asciiTheme="majorHAnsi" w:hAnsiTheme="majorHAnsi"/>
           <w:lang w:val="en-US"/>
         </w:rPr>
-        <w:t>COLLECTION_</w:t>
-      </w:r>
-      <w:r>
-        <w:rPr>
-          <w:rFonts w:asciiTheme="majorHAnsi" w:hAnsiTheme="majorHAnsi"/>
-          <w:lang w:val="en-US"/>
-        </w:rPr>
-        <w:t>REPORT (</w:t>
-      </w:r>
-      <w:r>
-        <w:rPr>
-          <w:rFonts w:asciiTheme="majorHAnsi" w:hAnsiTheme="majorHAnsi"/>
-          <w:lang w:val="en-US"/>
-        </w:rPr>
-        <w:t xml:space="preserve">contract_no, waste_type_id, waste_type_desc, </w:t>
+        <w:t xml:space="preserve">COLLECTION_REPORT (contract_no, waste_type_id, waste_type_desc, </w:t>
       </w:r>
     </w:p>
     <w:p>
@@ -113,21 +99,12 @@
           <w:lang w:val="en-US"/>
         </w:rPr>
       </w:pPr>
-      <w:proofErr w:type="spellStart"/>
-      <w:r>
-        <w:rPr>
-          <w:rFonts w:asciiTheme="majorHAnsi" w:hAnsiTheme="majorHAnsi"/>
-          <w:lang w:val="en-US"/>
-        </w:rPr>
-        <w:t>truck_make</w:t>
-      </w:r>
-      <w:proofErr w:type="spellEnd"/>
-      <w:r>
-        <w:rPr>
-          <w:rFonts w:asciiTheme="majorHAnsi" w:hAnsiTheme="majorHAnsi"/>
-          <w:lang w:val="en-US"/>
-        </w:rPr>
-        <w:t xml:space="preserve">, </w:t>
+      <w:r>
+        <w:rPr>
+          <w:rFonts w:asciiTheme="majorHAnsi" w:hAnsiTheme="majorHAnsi"/>
+          <w:lang w:val="en-US"/>
+        </w:rPr>
+        <w:t xml:space="preserve">truck_make, </w:t>
       </w:r>
       <w:proofErr w:type="spellStart"/>
       <w:r>
@@ -218,14 +195,7 @@
           <w:rFonts w:asciiTheme="majorHAnsi" w:hAnsiTheme="majorHAnsi"/>
           <w:lang w:val="en-US"/>
         </w:rPr>
-        <w:t>COLLECTION_</w:t>
-      </w:r>
-      <w:r>
-        <w:rPr>
-          <w:rFonts w:asciiTheme="majorHAnsi" w:hAnsiTheme="majorHAnsi"/>
-          <w:lang w:val="en-US"/>
-        </w:rPr>
-        <w:t>REPORT (</w:t>
+        <w:t>COLLECTION_REPORT (</w:t>
       </w:r>
       <w:r>
         <w:rPr>
@@ -282,21 +252,12 @@
           <w:lang w:val="en-US"/>
         </w:rPr>
       </w:pPr>
-      <w:proofErr w:type="spellStart"/>
-      <w:r>
-        <w:rPr>
-          <w:rFonts w:asciiTheme="majorHAnsi" w:hAnsiTheme="majorHAnsi"/>
-          <w:lang w:val="en-US"/>
-        </w:rPr>
-        <w:t>truck_make</w:t>
-      </w:r>
-      <w:proofErr w:type="spellEnd"/>
-      <w:r>
-        <w:rPr>
-          <w:rFonts w:asciiTheme="majorHAnsi" w:hAnsiTheme="majorHAnsi"/>
-          <w:lang w:val="en-US"/>
-        </w:rPr>
-        <w:t xml:space="preserve">, </w:t>
+      <w:r>
+        <w:rPr>
+          <w:rFonts w:asciiTheme="majorHAnsi" w:hAnsiTheme="majorHAnsi"/>
+          <w:lang w:val="en-US"/>
+        </w:rPr>
+        <w:t xml:space="preserve">truck_make, </w:t>
       </w:r>
       <w:proofErr w:type="spellStart"/>
       <w:r>
@@ -622,8 +583,9 @@
           <w:lang w:eastAsia="en-GB"/>
           <w14:ligatures w14:val="none"/>
         </w:rPr>
-        <w:t>c</w:t>
-      </w:r>
+        <w:t>collect_</w:t>
+      </w:r>
+      <w:proofErr w:type="gramStart"/>
       <w:r>
         <w:rPr>
           <w:rFonts w:asciiTheme="majorHAnsi" w:eastAsia="Times New Roman" w:hAnsiTheme="majorHAnsi" w:cs="Times New Roman"/>
@@ -631,9 +593,9 @@
           <w:lang w:eastAsia="en-GB"/>
           <w14:ligatures w14:val="none"/>
         </w:rPr>
-        <w:t>ollect_</w:t>
-      </w:r>
-      <w:proofErr w:type="gramStart"/>
+        <w:t>date</w:t>
+      </w:r>
+      <w:proofErr w:type="spellEnd"/>
       <w:r>
         <w:rPr>
           <w:rFonts w:asciiTheme="majorHAnsi" w:eastAsia="Times New Roman" w:hAnsiTheme="majorHAnsi" w:cs="Times New Roman"/>
@@ -641,9 +603,9 @@
           <w:lang w:eastAsia="en-GB"/>
           <w14:ligatures w14:val="none"/>
         </w:rPr>
-        <w:t>date</w:t>
-      </w:r>
-      <w:proofErr w:type="spellEnd"/>
+        <w:t xml:space="preserve"> ,</w:t>
+      </w:r>
+      <w:proofErr w:type="gramEnd"/>
       <w:r>
         <w:rPr>
           <w:rFonts w:asciiTheme="majorHAnsi" w:eastAsia="Times New Roman" w:hAnsiTheme="majorHAnsi" w:cs="Times New Roman"/>
@@ -653,6 +615,7 @@
         </w:rPr>
         <w:t xml:space="preserve"> </w:t>
       </w:r>
+      <w:proofErr w:type="spellStart"/>
       <w:r>
         <w:rPr>
           <w:rFonts w:asciiTheme="majorHAnsi" w:eastAsia="Times New Roman" w:hAnsiTheme="majorHAnsi" w:cs="Times New Roman"/>
@@ -660,9 +623,9 @@
           <w:lang w:eastAsia="en-GB"/>
           <w14:ligatures w14:val="none"/>
         </w:rPr>
-        <w:t>,</w:t>
-      </w:r>
-      <w:proofErr w:type="gramEnd"/>
+        <w:t>contract_no</w:t>
+      </w:r>
+      <w:proofErr w:type="spellEnd"/>
       <w:r>
         <w:rPr>
           <w:rFonts w:asciiTheme="majorHAnsi" w:eastAsia="Times New Roman" w:hAnsiTheme="majorHAnsi" w:cs="Times New Roman"/>
@@ -670,7 +633,7 @@
           <w:lang w:eastAsia="en-GB"/>
           <w14:ligatures w14:val="none"/>
         </w:rPr>
-        <w:t xml:space="preserve"> </w:t>
+        <w:t xml:space="preserve"> → </w:t>
       </w:r>
       <w:proofErr w:type="spellStart"/>
       <w:r>
@@ -680,7 +643,7 @@
           <w:lang w:eastAsia="en-GB"/>
           <w14:ligatures w14:val="none"/>
         </w:rPr>
-        <w:t>contract_no</w:t>
+        <w:t>truck_vin</w:t>
       </w:r>
       <w:proofErr w:type="spellEnd"/>
       <w:r>
@@ -690,7 +653,7 @@
           <w:lang w:eastAsia="en-GB"/>
           <w14:ligatures w14:val="none"/>
         </w:rPr>
-        <w:t xml:space="preserve"> → </w:t>
+        <w:t xml:space="preserve">, </w:t>
       </w:r>
       <w:proofErr w:type="spellStart"/>
       <w:r>
@@ -700,7 +663,7 @@
           <w:lang w:eastAsia="en-GB"/>
           <w14:ligatures w14:val="none"/>
         </w:rPr>
-        <w:t>truck_vin</w:t>
+        <w:t>truck_rego</w:t>
       </w:r>
       <w:proofErr w:type="spellEnd"/>
       <w:r>
@@ -720,7 +683,7 @@
           <w:lang w:eastAsia="en-GB"/>
           <w14:ligatures w14:val="none"/>
         </w:rPr>
-        <w:t>truck_rego</w:t>
+        <w:t>truck_make</w:t>
       </w:r>
       <w:proofErr w:type="spellEnd"/>
       <w:r>
@@ -740,9 +703,9 @@
           <w:lang w:eastAsia="en-GB"/>
           <w14:ligatures w14:val="none"/>
         </w:rPr>
-        <w:t>truck_make</w:t>
-      </w:r>
-      <w:proofErr w:type="spellEnd"/>
+        <w:t>truck_</w:t>
+      </w:r>
+      <w:proofErr w:type="gramStart"/>
       <w:r>
         <w:rPr>
           <w:rFonts w:asciiTheme="majorHAnsi" w:eastAsia="Times New Roman" w:hAnsiTheme="majorHAnsi" w:cs="Times New Roman"/>
@@ -750,9 +713,9 @@
           <w:lang w:eastAsia="en-GB"/>
           <w14:ligatures w14:val="none"/>
         </w:rPr>
-        <w:t xml:space="preserve">, </w:t>
-      </w:r>
-      <w:proofErr w:type="spellStart"/>
+        <w:t>model,truck</w:t>
+      </w:r>
+      <w:proofErr w:type="gramEnd"/>
       <w:r>
         <w:rPr>
           <w:rFonts w:asciiTheme="majorHAnsi" w:eastAsia="Times New Roman" w:hAnsiTheme="majorHAnsi" w:cs="Times New Roman"/>
@@ -760,88 +723,20 @@
           <w:lang w:eastAsia="en-GB"/>
           <w14:ligatures w14:val="none"/>
         </w:rPr>
-        <w:t>truck_</w:t>
-      </w:r>
-      <w:proofErr w:type="gramStart"/>
-      <w:r>
+        <w:t>_year</w:t>
+      </w:r>
+      <w:proofErr w:type="spellEnd"/>
+    </w:p>
+    <w:p>
+      <w:pPr>
+        <w:spacing w:after="0" w:line="240" w:lineRule="auto"/>
+        <w:ind w:left="404"/>
         <w:rPr>
           <w:rFonts w:asciiTheme="majorHAnsi" w:eastAsia="Times New Roman" w:hAnsiTheme="majorHAnsi" w:cs="Times New Roman"/>
           <w:kern w:val="0"/>
           <w:lang w:eastAsia="en-GB"/>
           <w14:ligatures w14:val="none"/>
         </w:rPr>
-        <w:t>model,truck</w:t>
-      </w:r>
-      <w:proofErr w:type="gramEnd"/>
-      <w:r>
-        <w:rPr>
-          <w:rFonts w:asciiTheme="majorHAnsi" w:eastAsia="Times New Roman" w:hAnsiTheme="majorHAnsi" w:cs="Times New Roman"/>
-          <w:kern w:val="0"/>
-          <w:lang w:eastAsia="en-GB"/>
-          <w14:ligatures w14:val="none"/>
-        </w:rPr>
-        <w:t>_year</w:t>
-      </w:r>
-      <w:proofErr w:type="spellEnd"/>
-    </w:p>
-    <w:p>
-      <w:pPr>
-        <w:pStyle w:val="ListParagraph"/>
-        <w:numPr>
-          <w:ilvl w:val="0"/>
-          <w:numId w:val="2"/>
-        </w:numPr>
-        <w:spacing w:after="0" w:line="240" w:lineRule="auto"/>
-        <w:rPr>
-          <w:rFonts w:asciiTheme="majorHAnsi" w:eastAsia="Times New Roman" w:hAnsiTheme="majorHAnsi" w:cs="Times New Roman"/>
-          <w:kern w:val="0"/>
-          <w:lang w:eastAsia="en-GB"/>
-          <w14:ligatures w14:val="none"/>
-        </w:rPr>
-      </w:pPr>
-      <w:proofErr w:type="spellStart"/>
-      <w:r>
-        <w:rPr>
-          <w:rFonts w:asciiTheme="majorHAnsi" w:hAnsiTheme="majorHAnsi"/>
-        </w:rPr>
-        <w:t>bin_rfid</w:t>
-      </w:r>
-      <w:proofErr w:type="spellEnd"/>
-      <w:r>
-        <w:rPr>
-          <w:rFonts w:asciiTheme="majorHAnsi" w:hAnsiTheme="majorHAnsi"/>
-        </w:rPr>
-        <w:t xml:space="preserve"> → </w:t>
-      </w:r>
-      <w:proofErr w:type="spellStart"/>
-      <w:r>
-        <w:rPr>
-          <w:rFonts w:asciiTheme="majorHAnsi" w:hAnsiTheme="majorHAnsi"/>
-        </w:rPr>
-        <w:t>collected_kgs</w:t>
-      </w:r>
-      <w:proofErr w:type="spellEnd"/>
-      <w:r>
-        <w:rPr>
-          <w:rFonts w:asciiTheme="majorHAnsi" w:hAnsiTheme="majorHAnsi"/>
-        </w:rPr>
-        <w:t>, overweight</w:t>
-      </w:r>
-    </w:p>
-    <w:p>
-      <w:pPr>
-        <w:spacing w:line="240" w:lineRule="auto"/>
-        <w:rPr>
-          <w:lang w:val="en-US"/>
-        </w:rPr>
-      </w:pPr>
-    </w:p>
-    <w:p>
-      <w:pPr>
-        <w:spacing w:line="240" w:lineRule="auto"/>
-        <w:rPr>
-          <w:lang w:val="en-US"/>
-        </w:rPr>
       </w:pPr>
     </w:p>
     <w:p>
@@ -855,7 +750,10 @@
           <w:lang w:val="en-US"/>
         </w:rPr>
       </w:pPr>
-      <w:r>
+    </w:p>
+    <w:p>
+      <w:pPr>
+        <w:spacing w:line="240" w:lineRule="auto"/>
         <w:rPr>
           <w:b/>
           <w:bCs/>
@@ -863,544 +761,521 @@
           <w:szCs w:val="26"/>
           <w:lang w:val="en-US"/>
         </w:rPr>
-        <w:t>2NF</w:t>
-      </w:r>
-    </w:p>
-    <w:p>
-      <w:pPr>
-        <w:spacing w:after="0" w:line="240" w:lineRule="auto"/>
-        <w:rPr>
-          <w:rFonts w:asciiTheme="majorHAnsi" w:hAnsiTheme="majorHAnsi"/>
-          <w:lang w:val="en-US"/>
-        </w:rPr>
-      </w:pPr>
-      <w:r>
-        <w:rPr>
-          <w:rFonts w:asciiTheme="majorHAnsi" w:hAnsiTheme="majorHAnsi"/>
-          <w:lang w:val="en-US"/>
-        </w:rPr>
-        <w:t>CONTRACT_</w:t>
-      </w:r>
-      <w:r>
-        <w:rPr>
-          <w:rFonts w:asciiTheme="majorHAnsi" w:hAnsiTheme="majorHAnsi"/>
-          <w:lang w:val="en-US"/>
-        </w:rPr>
-        <w:t>WASTE (</w:t>
-      </w:r>
-      <w:r>
-        <w:rPr>
-          <w:rFonts w:asciiTheme="majorHAnsi" w:hAnsiTheme="majorHAnsi"/>
-          <w:u w:val="single"/>
-          <w:lang w:val="en-US"/>
-        </w:rPr>
-        <w:t>contract_no</w:t>
-      </w:r>
-      <w:r>
-        <w:rPr>
-          <w:rFonts w:asciiTheme="majorHAnsi" w:hAnsiTheme="majorHAnsi"/>
-          <w:lang w:val="en-US"/>
-        </w:rPr>
-        <w:t xml:space="preserve">, waste_type_id, waste_type_desc, </w:t>
-      </w:r>
-    </w:p>
-    <w:p>
-      <w:pPr>
-        <w:spacing w:after="0" w:line="240" w:lineRule="auto"/>
-        <w:rPr>
-          <w:rFonts w:asciiTheme="majorHAnsi" w:hAnsiTheme="majorHAnsi"/>
-          <w:lang w:val="en-US"/>
-        </w:rPr>
-      </w:pPr>
-      <w:r>
-        <w:rPr>
-          <w:rFonts w:asciiTheme="majorHAnsi" w:hAnsiTheme="majorHAnsi"/>
-          <w:lang w:val="en-US"/>
-        </w:rPr>
-        <w:t>collection_frequency)</w:t>
-      </w:r>
-    </w:p>
-    <w:p>
-      <w:pPr>
-        <w:spacing w:line="240" w:lineRule="auto"/>
-        <w:rPr>
-          <w:rFonts w:asciiTheme="majorHAnsi" w:hAnsiTheme="majorHAnsi"/>
-          <w:lang w:val="en-US"/>
-        </w:rPr>
-      </w:pPr>
-      <w:r>
-        <w:rPr>
-          <w:rFonts w:asciiTheme="majorHAnsi" w:hAnsiTheme="majorHAnsi"/>
-          <w:b/>
-          <w:bCs/>
-          <w:lang w:val="en-US"/>
-        </w:rPr>
-        <w:t>CK</w:t>
-      </w:r>
-      <w:r>
-        <w:rPr>
-          <w:rFonts w:asciiTheme="majorHAnsi" w:hAnsiTheme="majorHAnsi"/>
-          <w:lang w:val="en-US"/>
-        </w:rPr>
-        <w:t>: contract_no</w:t>
-      </w:r>
-    </w:p>
-    <w:p>
-      <w:pPr>
-        <w:spacing w:line="240" w:lineRule="auto"/>
-        <w:rPr>
-          <w:rFonts w:asciiTheme="majorHAnsi" w:hAnsiTheme="majorHAnsi"/>
-          <w:lang w:val="en-US"/>
-        </w:rPr>
-      </w:pPr>
-    </w:p>
-    <w:p>
-      <w:pPr>
-        <w:spacing w:after="0" w:line="240" w:lineRule="auto"/>
-        <w:rPr>
-          <w:rFonts w:asciiTheme="majorHAnsi" w:hAnsiTheme="majorHAnsi"/>
-          <w:lang w:val="en-US"/>
-        </w:rPr>
-      </w:pPr>
-      <w:r>
-        <w:rPr>
-          <w:rFonts w:asciiTheme="majorHAnsi" w:hAnsiTheme="majorHAnsi"/>
-          <w:lang w:val="en-US"/>
-        </w:rPr>
-        <w:t>COLLECTION (</w:t>
-      </w:r>
-      <w:r>
-        <w:rPr>
-          <w:rFonts w:asciiTheme="majorHAnsi" w:hAnsiTheme="majorHAnsi"/>
-          <w:u w:val="single"/>
-          <w:lang w:val="en-US"/>
-        </w:rPr>
-        <w:t>contract_no</w:t>
-      </w:r>
-      <w:r>
-        <w:rPr>
-          <w:rFonts w:asciiTheme="majorHAnsi" w:hAnsiTheme="majorHAnsi"/>
-          <w:lang w:val="en-US"/>
-        </w:rPr>
-        <w:t xml:space="preserve">, </w:t>
-      </w:r>
-      <w:r>
-        <w:rPr>
-          <w:rFonts w:asciiTheme="majorHAnsi" w:hAnsiTheme="majorHAnsi"/>
-          <w:u w:val="single"/>
-          <w:lang w:val="en-US"/>
-        </w:rPr>
-        <w:t>collect_date</w:t>
-      </w:r>
-      <w:r>
-        <w:rPr>
-          <w:rFonts w:asciiTheme="majorHAnsi" w:hAnsiTheme="majorHAnsi"/>
-          <w:lang w:val="en-US"/>
-        </w:rPr>
-        <w:t xml:space="preserve">, truck_vin, truck_rego, </w:t>
-      </w:r>
-    </w:p>
-    <w:p>
-      <w:pPr>
-        <w:spacing w:after="0" w:line="240" w:lineRule="auto"/>
-        <w:rPr>
-          <w:rFonts w:asciiTheme="majorHAnsi" w:hAnsiTheme="majorHAnsi"/>
-          <w:lang w:val="en-US"/>
-        </w:rPr>
-      </w:pPr>
-      <w:proofErr w:type="spellStart"/>
-      <w:r>
-        <w:rPr>
-          <w:rFonts w:asciiTheme="majorHAnsi" w:hAnsiTheme="majorHAnsi"/>
-          <w:lang w:val="en-US"/>
-        </w:rPr>
-        <w:t>truck_make</w:t>
-      </w:r>
-      <w:proofErr w:type="spellEnd"/>
-      <w:r>
-        <w:rPr>
-          <w:rFonts w:asciiTheme="majorHAnsi" w:hAnsiTheme="majorHAnsi"/>
-          <w:lang w:val="en-US"/>
-        </w:rPr>
-        <w:t xml:space="preserve">, </w:t>
-      </w:r>
-      <w:proofErr w:type="spellStart"/>
-      <w:r>
-        <w:rPr>
-          <w:rFonts w:asciiTheme="majorHAnsi" w:hAnsiTheme="majorHAnsi"/>
-          <w:lang w:val="en-US"/>
-        </w:rPr>
-        <w:t>truck_model</w:t>
-      </w:r>
-      <w:proofErr w:type="spellEnd"/>
-      <w:r>
-        <w:rPr>
-          <w:rFonts w:asciiTheme="majorHAnsi" w:hAnsiTheme="majorHAnsi"/>
-          <w:lang w:val="en-US"/>
-        </w:rPr>
-        <w:t xml:space="preserve">, </w:t>
-      </w:r>
-      <w:proofErr w:type="spellStart"/>
-      <w:r>
-        <w:rPr>
-          <w:rFonts w:asciiTheme="majorHAnsi" w:hAnsiTheme="majorHAnsi"/>
-          <w:lang w:val="en-US"/>
-        </w:rPr>
-        <w:t>truck_year</w:t>
-      </w:r>
-      <w:proofErr w:type="spellEnd"/>
-      <w:r>
-        <w:rPr>
-          <w:rFonts w:asciiTheme="majorHAnsi" w:hAnsiTheme="majorHAnsi"/>
-          <w:lang w:val="en-US"/>
-        </w:rPr>
-        <w:t>)</w:t>
-      </w:r>
-    </w:p>
-    <w:p>
-      <w:pPr>
-        <w:spacing w:after="0" w:line="240" w:lineRule="auto"/>
-        <w:rPr>
-          <w:rFonts w:asciiTheme="majorHAnsi" w:hAnsiTheme="majorHAnsi"/>
-          <w:b/>
-          <w:bCs/>
-          <w:lang w:val="en-US"/>
-        </w:rPr>
-      </w:pPr>
-    </w:p>
-    <w:p>
-      <w:pPr>
-        <w:spacing w:after="0" w:line="240" w:lineRule="auto"/>
-        <w:rPr>
-          <w:rFonts w:asciiTheme="majorHAnsi" w:hAnsiTheme="majorHAnsi"/>
-          <w:lang w:val="en-US"/>
-        </w:rPr>
-      </w:pPr>
-      <w:r>
-        <w:rPr>
-          <w:rFonts w:asciiTheme="majorHAnsi" w:hAnsiTheme="majorHAnsi"/>
-          <w:b/>
-          <w:bCs/>
-          <w:lang w:val="en-US"/>
-        </w:rPr>
-        <w:t>CK</w:t>
-      </w:r>
-      <w:r>
-        <w:rPr>
-          <w:rFonts w:asciiTheme="majorHAnsi" w:hAnsiTheme="majorHAnsi"/>
-          <w:lang w:val="en-US"/>
-        </w:rPr>
-        <w:t>: contract_no, collect_date</w:t>
-      </w:r>
-    </w:p>
-    <w:p>
-      <w:pPr>
-        <w:spacing w:after="0" w:line="240" w:lineRule="auto"/>
-        <w:rPr>
-          <w:rFonts w:asciiTheme="majorHAnsi" w:hAnsiTheme="majorHAnsi"/>
-          <w:lang w:val="en-US"/>
-        </w:rPr>
-      </w:pPr>
-      <w:r>
-        <w:rPr>
-          <w:rFonts w:asciiTheme="majorHAnsi" w:hAnsiTheme="majorHAnsi"/>
-          <w:b/>
-          <w:bCs/>
-          <w:lang w:val="en-US"/>
-        </w:rPr>
-        <w:t>CK</w:t>
-      </w:r>
-      <w:r>
-        <w:rPr>
-          <w:rFonts w:asciiTheme="majorHAnsi" w:hAnsiTheme="majorHAnsi"/>
-          <w:lang w:val="en-US"/>
-        </w:rPr>
-        <w:t>: truck_vin, collect_date</w:t>
-      </w:r>
-    </w:p>
-    <w:p>
-      <w:pPr>
-        <w:spacing w:line="240" w:lineRule="auto"/>
-        <w:rPr>
-          <w:rFonts w:asciiTheme="majorHAnsi" w:hAnsiTheme="majorHAnsi"/>
-          <w:lang w:val="en-US"/>
-        </w:rPr>
-      </w:pPr>
-    </w:p>
-    <w:p>
-      <w:pPr>
-        <w:spacing w:after="0" w:line="240" w:lineRule="auto"/>
-        <w:rPr>
-          <w:rFonts w:asciiTheme="majorHAnsi" w:hAnsiTheme="majorHAnsi"/>
-          <w:lang w:val="en-US"/>
-        </w:rPr>
-      </w:pPr>
-      <w:r>
-        <w:rPr>
-          <w:rFonts w:asciiTheme="majorHAnsi" w:hAnsiTheme="majorHAnsi"/>
-          <w:lang w:val="en-US"/>
-        </w:rPr>
-        <w:t>BIN_</w:t>
-      </w:r>
-      <w:r>
-        <w:rPr>
-          <w:rFonts w:asciiTheme="majorHAnsi" w:hAnsiTheme="majorHAnsi"/>
-          <w:lang w:val="en-US"/>
-        </w:rPr>
-        <w:t>COLLECTION (</w:t>
-      </w:r>
-      <w:r>
-        <w:rPr>
-          <w:rFonts w:asciiTheme="majorHAnsi" w:hAnsiTheme="majorHAnsi"/>
-          <w:u w:val="single"/>
-          <w:lang w:val="en-US"/>
-        </w:rPr>
-        <w:t>contract_no</w:t>
-      </w:r>
-      <w:r>
-        <w:rPr>
-          <w:rFonts w:asciiTheme="majorHAnsi" w:hAnsiTheme="majorHAnsi"/>
-          <w:lang w:val="en-US"/>
-        </w:rPr>
-        <w:t xml:space="preserve">, </w:t>
-      </w:r>
-      <w:r>
-        <w:rPr>
-          <w:rFonts w:asciiTheme="majorHAnsi" w:hAnsiTheme="majorHAnsi"/>
-          <w:u w:val="single"/>
-          <w:lang w:val="en-US"/>
-        </w:rPr>
-        <w:t>collect_date</w:t>
-      </w:r>
-      <w:r>
-        <w:rPr>
-          <w:rFonts w:asciiTheme="majorHAnsi" w:hAnsiTheme="majorHAnsi"/>
-          <w:lang w:val="en-US"/>
-        </w:rPr>
-        <w:t xml:space="preserve">, </w:t>
-      </w:r>
-      <w:r>
-        <w:rPr>
-          <w:rFonts w:asciiTheme="majorHAnsi" w:hAnsiTheme="majorHAnsi"/>
-          <w:u w:val="single"/>
-          <w:lang w:val="en-US"/>
-        </w:rPr>
-        <w:t>bin_rfid</w:t>
-      </w:r>
-      <w:r>
-        <w:rPr>
-          <w:rFonts w:asciiTheme="majorHAnsi" w:hAnsiTheme="majorHAnsi"/>
-          <w:lang w:val="en-US"/>
-        </w:rPr>
-        <w:t xml:space="preserve">, </w:t>
-      </w:r>
-    </w:p>
-    <w:p>
-      <w:pPr>
-        <w:spacing w:after="0" w:line="240" w:lineRule="auto"/>
-        <w:rPr>
-          <w:rFonts w:asciiTheme="majorHAnsi" w:hAnsiTheme="majorHAnsi"/>
-          <w:lang w:val="en-US"/>
-        </w:rPr>
-      </w:pPr>
-      <w:r>
-        <w:rPr>
-          <w:rFonts w:asciiTheme="majorHAnsi" w:hAnsiTheme="majorHAnsi"/>
-          <w:lang w:val="en-US"/>
-        </w:rPr>
-        <w:lastRenderedPageBreak/>
-        <w:t>collected_kgs, overweight)</w:t>
-      </w:r>
-    </w:p>
-    <w:p>
-      <w:pPr>
-        <w:spacing w:line="240" w:lineRule="auto"/>
-        <w:rPr>
-          <w:rFonts w:asciiTheme="majorHAnsi" w:hAnsiTheme="majorHAnsi"/>
-          <w:lang w:val="en-US"/>
-        </w:rPr>
-      </w:pPr>
-      <w:r>
-        <w:rPr>
-          <w:rFonts w:asciiTheme="majorHAnsi" w:hAnsiTheme="majorHAnsi"/>
-          <w:b/>
-          <w:bCs/>
-          <w:lang w:val="en-US"/>
-        </w:rPr>
-        <w:t>CK</w:t>
-      </w:r>
-      <w:r>
-        <w:rPr>
-          <w:rFonts w:asciiTheme="majorHAnsi" w:hAnsiTheme="majorHAnsi"/>
-          <w:lang w:val="en-US"/>
-        </w:rPr>
-        <w:t>: contract_no, collect_date, bin_rfid</w:t>
-      </w:r>
-    </w:p>
-    <w:p>
-      <w:pPr>
-        <w:spacing w:line="240" w:lineRule="auto"/>
-        <w:rPr>
-          <w:rFonts w:asciiTheme="majorHAnsi" w:hAnsiTheme="majorHAnsi"/>
-          <w:lang w:val="en-US"/>
-        </w:rPr>
-      </w:pPr>
-    </w:p>
-    <w:p>
-      <w:pPr>
-        <w:spacing w:after="0" w:line="240" w:lineRule="auto"/>
-        <w:rPr>
-          <w:rFonts w:asciiTheme="majorHAnsi" w:hAnsiTheme="majorHAnsi"/>
-          <w:b/>
-          <w:bCs/>
-          <w:lang w:val="en-US"/>
-        </w:rPr>
-      </w:pPr>
-      <w:r>
-        <w:rPr>
-          <w:rFonts w:asciiTheme="majorHAnsi" w:hAnsiTheme="majorHAnsi"/>
-          <w:b/>
-          <w:bCs/>
-          <w:lang w:val="en-US"/>
-        </w:rPr>
-        <w:t>Transitive dependencies</w:t>
-      </w:r>
-      <w:r>
-        <w:rPr>
-          <w:rFonts w:asciiTheme="majorHAnsi" w:hAnsiTheme="majorHAnsi"/>
-          <w:b/>
-          <w:bCs/>
-          <w:lang w:val="en-US"/>
-        </w:rPr>
-        <w:t>:</w:t>
-      </w:r>
-    </w:p>
-    <w:p>
-      <w:pPr>
-        <w:spacing w:after="0" w:line="240" w:lineRule="auto"/>
-      </w:pPr>
-      <w:proofErr w:type="spellStart"/>
-      <w:r>
-        <w:t>waste_type_id</w:t>
-      </w:r>
-      <w:proofErr w:type="spellEnd"/>
-      <w:r>
-        <w:t xml:space="preserve"> → </w:t>
-      </w:r>
-      <w:proofErr w:type="spellStart"/>
-      <w:r>
-        <w:t>waste_type_desc</w:t>
-      </w:r>
-      <w:proofErr w:type="spellEnd"/>
-    </w:p>
-    <w:p>
-      <w:pPr>
-        <w:spacing w:after="0" w:line="240" w:lineRule="auto"/>
-        <w:rPr>
-          <w:rFonts w:asciiTheme="majorHAnsi" w:hAnsiTheme="majorHAnsi"/>
-        </w:rPr>
-      </w:pPr>
-      <w:proofErr w:type="spellStart"/>
-      <w:r>
-        <w:rPr>
-          <w:rFonts w:asciiTheme="majorHAnsi" w:hAnsiTheme="majorHAnsi"/>
-        </w:rPr>
-        <w:t>truck_vin</w:t>
-      </w:r>
-      <w:proofErr w:type="spellEnd"/>
-      <w:r>
-        <w:rPr>
-          <w:rFonts w:asciiTheme="majorHAnsi" w:hAnsiTheme="majorHAnsi"/>
-        </w:rPr>
-        <w:t xml:space="preserve"> → </w:t>
-      </w:r>
-      <w:proofErr w:type="spellStart"/>
-      <w:r>
-        <w:rPr>
-          <w:rFonts w:asciiTheme="majorHAnsi" w:hAnsiTheme="majorHAnsi"/>
-        </w:rPr>
-        <w:t>truck_rego</w:t>
-      </w:r>
-      <w:proofErr w:type="spellEnd"/>
-      <w:r>
-        <w:rPr>
-          <w:rFonts w:asciiTheme="majorHAnsi" w:hAnsiTheme="majorHAnsi"/>
-        </w:rPr>
-        <w:t xml:space="preserve">, </w:t>
-      </w:r>
-      <w:proofErr w:type="spellStart"/>
-      <w:r>
-        <w:rPr>
-          <w:rFonts w:asciiTheme="majorHAnsi" w:hAnsiTheme="majorHAnsi"/>
-        </w:rPr>
-        <w:t>truck_make</w:t>
-      </w:r>
-      <w:proofErr w:type="spellEnd"/>
-      <w:r>
-        <w:rPr>
-          <w:rFonts w:asciiTheme="majorHAnsi" w:hAnsiTheme="majorHAnsi"/>
-        </w:rPr>
-        <w:t xml:space="preserve">, </w:t>
-      </w:r>
-      <w:proofErr w:type="spellStart"/>
-      <w:r>
-        <w:rPr>
-          <w:rFonts w:asciiTheme="majorHAnsi" w:hAnsiTheme="majorHAnsi"/>
-        </w:rPr>
-        <w:t>truck_model</w:t>
-      </w:r>
-      <w:proofErr w:type="spellEnd"/>
-      <w:r>
-        <w:rPr>
-          <w:rFonts w:asciiTheme="majorHAnsi" w:hAnsiTheme="majorHAnsi"/>
-        </w:rPr>
-        <w:t xml:space="preserve">, </w:t>
-      </w:r>
-      <w:proofErr w:type="spellStart"/>
-      <w:r>
-        <w:rPr>
-          <w:rFonts w:asciiTheme="majorHAnsi" w:hAnsiTheme="majorHAnsi"/>
-        </w:rPr>
-        <w:t>truck_year</w:t>
-      </w:r>
-      <w:proofErr w:type="spellEnd"/>
-    </w:p>
-    <w:p>
-      <w:pPr>
-        <w:spacing w:after="0" w:line="240" w:lineRule="auto"/>
-        <w:rPr>
-          <w:rFonts w:asciiTheme="majorHAnsi" w:hAnsiTheme="majorHAnsi"/>
-        </w:rPr>
-      </w:pPr>
-    </w:p>
-    <w:p>
-      <w:pPr>
-        <w:spacing w:after="0" w:line="240" w:lineRule="auto"/>
-        <w:rPr>
-          <w:rFonts w:asciiTheme="majorHAnsi" w:hAnsiTheme="majorHAnsi"/>
-        </w:rPr>
-      </w:pPr>
-    </w:p>
-    <w:p>
-      <w:pPr>
-        <w:spacing w:after="0" w:line="240" w:lineRule="auto"/>
-        <w:rPr>
-          <w:rFonts w:asciiTheme="majorHAnsi" w:hAnsiTheme="majorHAnsi"/>
-        </w:rPr>
-      </w:pPr>
-    </w:p>
-    <w:p>
-      <w:pPr>
-        <w:spacing w:after="0" w:line="240" w:lineRule="auto"/>
-        <w:rPr>
-          <w:rFonts w:asciiTheme="majorHAnsi" w:hAnsiTheme="majorHAnsi"/>
+      </w:pPr>
+      <w:r>
+        <w:rPr>
           <w:b/>
           <w:bCs/>
           <w:sz w:val="26"/>
           <w:szCs w:val="26"/>
-        </w:rPr>
-      </w:pPr>
-      <w:r>
+          <w:lang w:val="en-US"/>
+        </w:rPr>
+        <w:t>2NF</w:t>
+      </w:r>
+    </w:p>
+    <w:p>
+      <w:pPr>
+        <w:spacing w:after="0" w:line="240" w:lineRule="auto"/>
+        <w:rPr>
+          <w:rFonts w:asciiTheme="majorHAnsi" w:hAnsiTheme="majorHAnsi"/>
+          <w:lang w:val="en-US"/>
+        </w:rPr>
+      </w:pPr>
+      <w:r>
+        <w:rPr>
+          <w:rFonts w:asciiTheme="majorHAnsi" w:hAnsiTheme="majorHAnsi"/>
+          <w:lang w:val="en-US"/>
+        </w:rPr>
+        <w:t>CONTRACT_WASTE (</w:t>
+      </w:r>
+      <w:r>
+        <w:rPr>
+          <w:rFonts w:asciiTheme="majorHAnsi" w:hAnsiTheme="majorHAnsi"/>
+          <w:u w:val="single"/>
+          <w:lang w:val="en-US"/>
+        </w:rPr>
+        <w:t>contract_no</w:t>
+      </w:r>
+      <w:r>
+        <w:rPr>
+          <w:rFonts w:asciiTheme="majorHAnsi" w:hAnsiTheme="majorHAnsi"/>
+          <w:lang w:val="en-US"/>
+        </w:rPr>
+        <w:t xml:space="preserve">, waste_type_id, waste_type_desc, </w:t>
+      </w:r>
+    </w:p>
+    <w:p>
+      <w:pPr>
+        <w:spacing w:after="0" w:line="240" w:lineRule="auto"/>
+        <w:rPr>
+          <w:rFonts w:asciiTheme="majorHAnsi" w:hAnsiTheme="majorHAnsi"/>
+          <w:lang w:val="en-US"/>
+        </w:rPr>
+      </w:pPr>
+      <w:r>
+        <w:rPr>
+          <w:rFonts w:asciiTheme="majorHAnsi" w:hAnsiTheme="majorHAnsi"/>
+          <w:lang w:val="en-US"/>
+        </w:rPr>
+        <w:t>collection_frequency)</w:t>
+      </w:r>
+    </w:p>
+    <w:p>
+      <w:pPr>
+        <w:spacing w:line="240" w:lineRule="auto"/>
+        <w:rPr>
+          <w:rFonts w:asciiTheme="majorHAnsi" w:hAnsiTheme="majorHAnsi"/>
+          <w:lang w:val="en-US"/>
+        </w:rPr>
+      </w:pPr>
+      <w:r>
+        <w:rPr>
+          <w:rFonts w:asciiTheme="majorHAnsi" w:hAnsiTheme="majorHAnsi"/>
+          <w:b/>
+          <w:bCs/>
+          <w:lang w:val="en-US"/>
+        </w:rPr>
+        <w:t>CK</w:t>
+      </w:r>
+      <w:r>
+        <w:rPr>
+          <w:rFonts w:asciiTheme="majorHAnsi" w:hAnsiTheme="majorHAnsi"/>
+          <w:lang w:val="en-US"/>
+        </w:rPr>
+        <w:t>: contract_no</w:t>
+      </w:r>
+    </w:p>
+    <w:p>
+      <w:pPr>
+        <w:spacing w:line="240" w:lineRule="auto"/>
+        <w:rPr>
+          <w:rFonts w:asciiTheme="majorHAnsi" w:hAnsiTheme="majorHAnsi"/>
+          <w:lang w:val="en-US"/>
+        </w:rPr>
+      </w:pPr>
+    </w:p>
+    <w:p>
+      <w:pPr>
+        <w:spacing w:after="0" w:line="240" w:lineRule="auto"/>
+        <w:rPr>
+          <w:rFonts w:asciiTheme="majorHAnsi" w:hAnsiTheme="majorHAnsi"/>
+          <w:lang w:val="en-US"/>
+        </w:rPr>
+      </w:pPr>
+      <w:r>
+        <w:rPr>
+          <w:rFonts w:asciiTheme="majorHAnsi" w:hAnsiTheme="majorHAnsi"/>
+          <w:lang w:val="en-US"/>
+        </w:rPr>
+        <w:t>COLLECTION (</w:t>
+      </w:r>
+      <w:r>
+        <w:rPr>
+          <w:rFonts w:asciiTheme="majorHAnsi" w:hAnsiTheme="majorHAnsi"/>
+          <w:u w:val="single"/>
+          <w:lang w:val="en-US"/>
+        </w:rPr>
+        <w:t>contract_no</w:t>
+      </w:r>
+      <w:r>
+        <w:rPr>
+          <w:rFonts w:asciiTheme="majorHAnsi" w:hAnsiTheme="majorHAnsi"/>
+          <w:lang w:val="en-US"/>
+        </w:rPr>
+        <w:t xml:space="preserve">, </w:t>
+      </w:r>
+      <w:r>
+        <w:rPr>
+          <w:rFonts w:asciiTheme="majorHAnsi" w:hAnsiTheme="majorHAnsi"/>
+          <w:u w:val="single"/>
+          <w:lang w:val="en-US"/>
+        </w:rPr>
+        <w:t>collect_date</w:t>
+      </w:r>
+      <w:r>
+        <w:rPr>
+          <w:rFonts w:asciiTheme="majorHAnsi" w:hAnsiTheme="majorHAnsi"/>
+          <w:lang w:val="en-US"/>
+        </w:rPr>
+        <w:t xml:space="preserve">, truck_vin, truck_rego, </w:t>
+      </w:r>
+    </w:p>
+    <w:p>
+      <w:pPr>
+        <w:spacing w:after="0" w:line="240" w:lineRule="auto"/>
+        <w:rPr>
+          <w:rFonts w:asciiTheme="majorHAnsi" w:hAnsiTheme="majorHAnsi"/>
+          <w:lang w:val="en-US"/>
+        </w:rPr>
+      </w:pPr>
+      <w:r>
+        <w:rPr>
+          <w:rFonts w:asciiTheme="majorHAnsi" w:hAnsiTheme="majorHAnsi"/>
+          <w:lang w:val="en-US"/>
+        </w:rPr>
+        <w:t xml:space="preserve">truck_make, </w:t>
+      </w:r>
+      <w:proofErr w:type="spellStart"/>
+      <w:r>
+        <w:rPr>
+          <w:rFonts w:asciiTheme="majorHAnsi" w:hAnsiTheme="majorHAnsi"/>
+          <w:lang w:val="en-US"/>
+        </w:rPr>
+        <w:t>truck_model</w:t>
+      </w:r>
+      <w:proofErr w:type="spellEnd"/>
+      <w:r>
+        <w:rPr>
+          <w:rFonts w:asciiTheme="majorHAnsi" w:hAnsiTheme="majorHAnsi"/>
+          <w:lang w:val="en-US"/>
+        </w:rPr>
+        <w:t xml:space="preserve">, </w:t>
+      </w:r>
+      <w:proofErr w:type="spellStart"/>
+      <w:r>
+        <w:rPr>
+          <w:rFonts w:asciiTheme="majorHAnsi" w:hAnsiTheme="majorHAnsi"/>
+          <w:lang w:val="en-US"/>
+        </w:rPr>
+        <w:t>truck_year</w:t>
+      </w:r>
+      <w:proofErr w:type="spellEnd"/>
+      <w:r>
+        <w:rPr>
+          <w:rFonts w:asciiTheme="majorHAnsi" w:hAnsiTheme="majorHAnsi"/>
+          <w:lang w:val="en-US"/>
+        </w:rPr>
+        <w:t>)</w:t>
+      </w:r>
+    </w:p>
+    <w:p>
+      <w:pPr>
+        <w:spacing w:after="0" w:line="240" w:lineRule="auto"/>
+        <w:rPr>
+          <w:rFonts w:asciiTheme="majorHAnsi" w:hAnsiTheme="majorHAnsi"/>
+          <w:b/>
+          <w:bCs/>
+          <w:lang w:val="en-US"/>
+        </w:rPr>
+      </w:pPr>
+    </w:p>
+    <w:p>
+      <w:pPr>
+        <w:spacing w:after="0" w:line="240" w:lineRule="auto"/>
+        <w:rPr>
+          <w:rFonts w:asciiTheme="majorHAnsi" w:hAnsiTheme="majorHAnsi"/>
+          <w:lang w:val="en-US"/>
+        </w:rPr>
+      </w:pPr>
+      <w:r>
+        <w:rPr>
+          <w:rFonts w:asciiTheme="majorHAnsi" w:hAnsiTheme="majorHAnsi"/>
+          <w:b/>
+          <w:bCs/>
+          <w:lang w:val="en-US"/>
+        </w:rPr>
+        <w:t>CK</w:t>
+      </w:r>
+      <w:r>
+        <w:rPr>
+          <w:rFonts w:asciiTheme="majorHAnsi" w:hAnsiTheme="majorHAnsi"/>
+          <w:lang w:val="en-US"/>
+        </w:rPr>
+        <w:t>: contract_no, collect_date</w:t>
+      </w:r>
+    </w:p>
+    <w:p>
+      <w:pPr>
+        <w:spacing w:after="0" w:line="240" w:lineRule="auto"/>
+        <w:rPr>
+          <w:rFonts w:asciiTheme="majorHAnsi" w:hAnsiTheme="majorHAnsi"/>
+          <w:lang w:val="en-US"/>
+        </w:rPr>
+      </w:pPr>
+      <w:r>
+        <w:rPr>
+          <w:rFonts w:asciiTheme="majorHAnsi" w:hAnsiTheme="majorHAnsi"/>
+          <w:b/>
+          <w:bCs/>
+          <w:lang w:val="en-US"/>
+        </w:rPr>
+        <w:t>CK</w:t>
+      </w:r>
+      <w:r>
+        <w:rPr>
+          <w:rFonts w:asciiTheme="majorHAnsi" w:hAnsiTheme="majorHAnsi"/>
+          <w:lang w:val="en-US"/>
+        </w:rPr>
+        <w:t>: truck_vin, collect_date</w:t>
+      </w:r>
+    </w:p>
+    <w:p>
+      <w:pPr>
+        <w:spacing w:line="240" w:lineRule="auto"/>
+        <w:rPr>
+          <w:rFonts w:asciiTheme="majorHAnsi" w:hAnsiTheme="majorHAnsi"/>
+          <w:lang w:val="en-US"/>
+        </w:rPr>
+      </w:pPr>
+    </w:p>
+    <w:p>
+      <w:pPr>
+        <w:spacing w:after="0" w:line="240" w:lineRule="auto"/>
+        <w:rPr>
+          <w:rFonts w:asciiTheme="majorHAnsi" w:hAnsiTheme="majorHAnsi"/>
+          <w:lang w:val="en-US"/>
+        </w:rPr>
+      </w:pPr>
+      <w:r>
+        <w:rPr>
+          <w:rFonts w:asciiTheme="majorHAnsi" w:hAnsiTheme="majorHAnsi"/>
+          <w:lang w:val="en-US"/>
+        </w:rPr>
+        <w:t>BIN_COLLECTION (</w:t>
+      </w:r>
+      <w:r>
+        <w:rPr>
+          <w:rFonts w:asciiTheme="majorHAnsi" w:hAnsiTheme="majorHAnsi"/>
+          <w:u w:val="single"/>
+          <w:lang w:val="en-US"/>
+        </w:rPr>
+        <w:t>contract_no</w:t>
+      </w:r>
+      <w:r>
+        <w:rPr>
+          <w:rFonts w:asciiTheme="majorHAnsi" w:hAnsiTheme="majorHAnsi"/>
+          <w:lang w:val="en-US"/>
+        </w:rPr>
+        <w:t xml:space="preserve">, </w:t>
+      </w:r>
+      <w:r>
+        <w:rPr>
+          <w:rFonts w:asciiTheme="majorHAnsi" w:hAnsiTheme="majorHAnsi"/>
+          <w:u w:val="single"/>
+          <w:lang w:val="en-US"/>
+        </w:rPr>
+        <w:t>collect_date</w:t>
+      </w:r>
+      <w:r>
+        <w:rPr>
+          <w:rFonts w:asciiTheme="majorHAnsi" w:hAnsiTheme="majorHAnsi"/>
+          <w:lang w:val="en-US"/>
+        </w:rPr>
+        <w:t xml:space="preserve">, </w:t>
+      </w:r>
+      <w:r>
+        <w:rPr>
+          <w:rFonts w:asciiTheme="majorHAnsi" w:hAnsiTheme="majorHAnsi"/>
+          <w:u w:val="single"/>
+          <w:lang w:val="en-US"/>
+        </w:rPr>
+        <w:t>bin_rfid</w:t>
+      </w:r>
+      <w:r>
+        <w:rPr>
+          <w:rFonts w:asciiTheme="majorHAnsi" w:hAnsiTheme="majorHAnsi"/>
+          <w:lang w:val="en-US"/>
+        </w:rPr>
+        <w:t xml:space="preserve">, </w:t>
+      </w:r>
+    </w:p>
+    <w:p>
+      <w:pPr>
+        <w:spacing w:after="0" w:line="240" w:lineRule="auto"/>
+        <w:rPr>
+          <w:rFonts w:asciiTheme="majorHAnsi" w:hAnsiTheme="majorHAnsi"/>
+          <w:lang w:val="en-US"/>
+        </w:rPr>
+      </w:pPr>
+      <w:r>
+        <w:rPr>
+          <w:rFonts w:asciiTheme="majorHAnsi" w:hAnsiTheme="majorHAnsi"/>
+          <w:lang w:val="en-US"/>
+        </w:rPr>
+        <w:t>collected_kgs, overweight)</w:t>
+      </w:r>
+    </w:p>
+    <w:p>
+      <w:pPr>
+        <w:spacing w:line="240" w:lineRule="auto"/>
+        <w:rPr>
+          <w:rFonts w:asciiTheme="majorHAnsi" w:hAnsiTheme="majorHAnsi"/>
+          <w:lang w:val="en-US"/>
+        </w:rPr>
+      </w:pPr>
+      <w:r>
+        <w:rPr>
+          <w:rFonts w:asciiTheme="majorHAnsi" w:hAnsiTheme="majorHAnsi"/>
+          <w:b/>
+          <w:bCs/>
+          <w:lang w:val="en-US"/>
+        </w:rPr>
+        <w:lastRenderedPageBreak/>
+        <w:t>CK</w:t>
+      </w:r>
+      <w:r>
+        <w:rPr>
+          <w:rFonts w:asciiTheme="majorHAnsi" w:hAnsiTheme="majorHAnsi"/>
+          <w:lang w:val="en-US"/>
+        </w:rPr>
+        <w:t>: contract_no, collect_date, bin_rfid</w:t>
+      </w:r>
+    </w:p>
+    <w:p>
+      <w:pPr>
+        <w:spacing w:line="240" w:lineRule="auto"/>
+        <w:rPr>
+          <w:rFonts w:asciiTheme="majorHAnsi" w:hAnsiTheme="majorHAnsi"/>
+          <w:lang w:val="en-US"/>
+        </w:rPr>
+      </w:pPr>
+    </w:p>
+    <w:p>
+      <w:pPr>
+        <w:spacing w:after="0" w:line="240" w:lineRule="auto"/>
+        <w:rPr>
+          <w:rFonts w:asciiTheme="majorHAnsi" w:hAnsiTheme="majorHAnsi"/>
+          <w:b/>
+          <w:bCs/>
+          <w:lang w:val="en-US"/>
+        </w:rPr>
+      </w:pPr>
+      <w:r>
+        <w:rPr>
+          <w:rFonts w:asciiTheme="majorHAnsi" w:hAnsiTheme="majorHAnsi"/>
+          <w:b/>
+          <w:bCs/>
+          <w:lang w:val="en-US"/>
+        </w:rPr>
+        <w:t>Transitive dependencies</w:t>
+      </w:r>
+      <w:r>
+        <w:rPr>
+          <w:rFonts w:asciiTheme="majorHAnsi" w:hAnsiTheme="majorHAnsi"/>
+          <w:b/>
+          <w:bCs/>
+          <w:lang w:val="en-US"/>
+        </w:rPr>
+        <w:t>:</w:t>
+      </w:r>
+    </w:p>
+    <w:p>
+      <w:pPr>
+        <w:spacing w:after="0" w:line="240" w:lineRule="auto"/>
+      </w:pPr>
+      <w:proofErr w:type="spellStart"/>
+      <w:r>
+        <w:t>waste_type_id</w:t>
+      </w:r>
+      <w:proofErr w:type="spellEnd"/>
+      <w:r>
+        <w:t xml:space="preserve"> → </w:t>
+      </w:r>
+      <w:proofErr w:type="spellStart"/>
+      <w:r>
+        <w:t>waste_type_desc</w:t>
+      </w:r>
+      <w:proofErr w:type="spellEnd"/>
+    </w:p>
+    <w:p>
+      <w:pPr>
+        <w:spacing w:after="0" w:line="240" w:lineRule="auto"/>
+        <w:rPr>
+          <w:rFonts w:asciiTheme="majorHAnsi" w:hAnsiTheme="majorHAnsi"/>
+        </w:rPr>
+      </w:pPr>
+      <w:proofErr w:type="spellStart"/>
+      <w:r>
+        <w:rPr>
+          <w:rFonts w:asciiTheme="majorHAnsi" w:hAnsiTheme="majorHAnsi"/>
+        </w:rPr>
+        <w:t>truck_vin</w:t>
+      </w:r>
+      <w:proofErr w:type="spellEnd"/>
+      <w:r>
+        <w:rPr>
+          <w:rFonts w:asciiTheme="majorHAnsi" w:hAnsiTheme="majorHAnsi"/>
+        </w:rPr>
+        <w:t xml:space="preserve"> → </w:t>
+      </w:r>
+      <w:proofErr w:type="spellStart"/>
+      <w:r>
+        <w:rPr>
+          <w:rFonts w:asciiTheme="majorHAnsi" w:hAnsiTheme="majorHAnsi"/>
+        </w:rPr>
+        <w:t>truck_rego</w:t>
+      </w:r>
+      <w:proofErr w:type="spellEnd"/>
+      <w:r>
+        <w:rPr>
+          <w:rFonts w:asciiTheme="majorHAnsi" w:hAnsiTheme="majorHAnsi"/>
+        </w:rPr>
+        <w:t xml:space="preserve">, </w:t>
+      </w:r>
+      <w:proofErr w:type="spellStart"/>
+      <w:r>
+        <w:rPr>
+          <w:rFonts w:asciiTheme="majorHAnsi" w:hAnsiTheme="majorHAnsi"/>
+        </w:rPr>
+        <w:t>truck_make</w:t>
+      </w:r>
+      <w:proofErr w:type="spellEnd"/>
+      <w:r>
+        <w:rPr>
+          <w:rFonts w:asciiTheme="majorHAnsi" w:hAnsiTheme="majorHAnsi"/>
+        </w:rPr>
+        <w:t xml:space="preserve">, </w:t>
+      </w:r>
+      <w:proofErr w:type="spellStart"/>
+      <w:r>
+        <w:rPr>
+          <w:rFonts w:asciiTheme="majorHAnsi" w:hAnsiTheme="majorHAnsi"/>
+        </w:rPr>
+        <w:t>truck_model</w:t>
+      </w:r>
+      <w:proofErr w:type="spellEnd"/>
+      <w:r>
+        <w:rPr>
+          <w:rFonts w:asciiTheme="majorHAnsi" w:hAnsiTheme="majorHAnsi"/>
+        </w:rPr>
+        <w:t xml:space="preserve">, </w:t>
+      </w:r>
+      <w:proofErr w:type="spellStart"/>
+      <w:r>
+        <w:rPr>
+          <w:rFonts w:asciiTheme="majorHAnsi" w:hAnsiTheme="majorHAnsi"/>
+        </w:rPr>
+        <w:t>truck_year</w:t>
+      </w:r>
+      <w:proofErr w:type="spellEnd"/>
+    </w:p>
+    <w:p>
+      <w:pPr>
+        <w:spacing w:after="0" w:line="240" w:lineRule="auto"/>
+        <w:rPr>
+          <w:rFonts w:asciiTheme="majorHAnsi" w:hAnsiTheme="majorHAnsi"/>
+        </w:rPr>
+      </w:pPr>
+    </w:p>
+    <w:p>
+      <w:pPr>
+        <w:spacing w:after="0" w:line="240" w:lineRule="auto"/>
+        <w:rPr>
+          <w:rFonts w:asciiTheme="majorHAnsi" w:hAnsiTheme="majorHAnsi"/>
+        </w:rPr>
+      </w:pPr>
+    </w:p>
+    <w:p>
+      <w:pPr>
+        <w:spacing w:after="0" w:line="240" w:lineRule="auto"/>
+        <w:rPr>
+          <w:rFonts w:asciiTheme="majorHAnsi" w:hAnsiTheme="majorHAnsi"/>
+        </w:rPr>
+      </w:pPr>
+    </w:p>
+    <w:p>
+      <w:pPr>
+        <w:spacing w:after="0" w:line="240" w:lineRule="auto"/>
         <w:rPr>
           <w:rFonts w:asciiTheme="majorHAnsi" w:hAnsiTheme="majorHAnsi"/>
           <w:b/>
@@ -1408,113 +1283,43 @@
           <w:sz w:val="26"/>
           <w:szCs w:val="26"/>
         </w:rPr>
-        <w:t>3NF</w:t>
-      </w:r>
-    </w:p>
-    <w:p>
-      <w:pPr>
-        <w:spacing w:after="0" w:line="240" w:lineRule="auto"/>
+      </w:pPr>
+      <w:r>
         <w:rPr>
           <w:rFonts w:asciiTheme="majorHAnsi" w:hAnsiTheme="majorHAnsi"/>
           <w:b/>
           <w:bCs/>
-          <w:lang w:val="en-US"/>
-        </w:rPr>
-      </w:pPr>
-    </w:p>
-    <w:p>
-      <w:pPr>
-        <w:spacing w:after="0" w:line="240" w:lineRule="auto"/>
-        <w:rPr>
-          <w:rFonts w:asciiTheme="majorHAnsi" w:hAnsiTheme="majorHAnsi"/>
-          <w:lang w:val="en-US"/>
-        </w:rPr>
-      </w:pPr>
-      <w:r>
-        <w:rPr>
-          <w:rFonts w:asciiTheme="majorHAnsi" w:hAnsiTheme="majorHAnsi"/>
-          <w:lang w:val="en-US"/>
-        </w:rPr>
-        <w:t>CONTRACT_</w:t>
-      </w:r>
-      <w:r>
-        <w:rPr>
-          <w:rFonts w:asciiTheme="majorHAnsi" w:hAnsiTheme="majorHAnsi"/>
-          <w:lang w:val="en-US"/>
-        </w:rPr>
-        <w:t>WASTE (</w:t>
-      </w:r>
-      <w:r>
-        <w:rPr>
-          <w:rFonts w:asciiTheme="majorHAnsi" w:hAnsiTheme="majorHAnsi"/>
-          <w:u w:val="single"/>
-          <w:lang w:val="en-US"/>
-        </w:rPr>
-        <w:t>contract_no,</w:t>
-      </w:r>
-      <w:r>
-        <w:rPr>
-          <w:rFonts w:asciiTheme="majorHAnsi" w:hAnsiTheme="majorHAnsi"/>
-          <w:lang w:val="en-US"/>
-        </w:rPr>
-        <w:t xml:space="preserve"> waste_type_id, collection_frequency)</w:t>
-      </w:r>
-    </w:p>
-    <w:p>
-      <w:pPr>
-        <w:spacing w:after="0" w:line="240" w:lineRule="auto"/>
-        <w:rPr>
-          <w:rFonts w:asciiTheme="majorHAnsi" w:hAnsiTheme="majorHAnsi"/>
-          <w:lang w:val="en-US"/>
-        </w:rPr>
-      </w:pPr>
-      <w:r>
+          <w:sz w:val="26"/>
+          <w:szCs w:val="26"/>
+        </w:rPr>
+        <w:t>3NF</w:t>
+      </w:r>
+    </w:p>
+    <w:p>
+      <w:pPr>
+        <w:spacing w:after="0" w:line="240" w:lineRule="auto"/>
         <w:rPr>
           <w:rFonts w:asciiTheme="majorHAnsi" w:hAnsiTheme="majorHAnsi"/>
           <w:b/>
           <w:bCs/>
           <w:lang w:val="en-US"/>
         </w:rPr>
-        <w:t>CK</w:t>
-      </w:r>
-      <w:r>
-        <w:rPr>
-          <w:rFonts w:asciiTheme="majorHAnsi" w:hAnsiTheme="majorHAnsi"/>
-          <w:lang w:val="en-US"/>
-        </w:rPr>
-        <w:t>: contract_no</w:t>
-      </w:r>
-    </w:p>
-    <w:p>
-      <w:pPr>
-        <w:spacing w:after="0" w:line="240" w:lineRule="auto"/>
-        <w:rPr>
-          <w:rFonts w:asciiTheme="majorHAnsi" w:hAnsiTheme="majorHAnsi"/>
-          <w:lang w:val="en-US"/>
-        </w:rPr>
-      </w:pPr>
-    </w:p>
-    <w:p>
-      <w:pPr>
-        <w:spacing w:after="0" w:line="240" w:lineRule="auto"/>
-        <w:rPr>
-          <w:rFonts w:asciiTheme="majorHAnsi" w:hAnsiTheme="majorHAnsi"/>
-          <w:lang w:val="en-US"/>
-        </w:rPr>
-      </w:pPr>
-      <w:r>
-        <w:rPr>
-          <w:rFonts w:asciiTheme="majorHAnsi" w:hAnsiTheme="majorHAnsi"/>
-          <w:lang w:val="en-US"/>
-        </w:rPr>
-        <w:t>WASTE_</w:t>
-      </w:r>
-      <w:r>
-        <w:rPr>
-          <w:rFonts w:asciiTheme="majorHAnsi" w:hAnsiTheme="majorHAnsi"/>
-          <w:lang w:val="en-US"/>
-        </w:rPr>
-        <w:t>TYPE (</w:t>
+      </w:pPr>
+    </w:p>
+    <w:p>
+      <w:pPr>
+        <w:spacing w:after="0" w:line="240" w:lineRule="auto"/>
+        <w:rPr>
+          <w:rFonts w:asciiTheme="majorHAnsi" w:hAnsiTheme="majorHAnsi"/>
+          <w:lang w:val="en-US"/>
+        </w:rPr>
+      </w:pPr>
+      <w:r>
+        <w:rPr>
+          <w:rFonts w:asciiTheme="majorHAnsi" w:hAnsiTheme="majorHAnsi"/>
+          <w:lang w:val="en-US"/>
+        </w:rPr>
+        <w:t>CONTRACT_WASTE (</w:t>
       </w:r>
       <w:r>
         <w:rPr>
@@ -1522,14 +1327,14 @@
           <w:u w:val="single"/>
           <w:lang w:val="en-US"/>
         </w:rPr>
-        <w:t>waste_type_id</w:t>
-      </w:r>
-      <w:r>
-        <w:rPr>
-          <w:rFonts w:asciiTheme="majorHAnsi" w:hAnsiTheme="majorHAnsi"/>
-          <w:lang w:val="en-US"/>
-        </w:rPr>
-        <w:t>, waste_type_desc)</w:t>
+        <w:t>contract_no,</w:t>
+      </w:r>
+      <w:r>
+        <w:rPr>
+          <w:rFonts w:asciiTheme="majorHAnsi" w:hAnsiTheme="majorHAnsi"/>
+          <w:lang w:val="en-US"/>
+        </w:rPr>
+        <w:t xml:space="preserve"> waste_type_id, collection_frequency)</w:t>
       </w:r>
     </w:p>
     <w:p>
@@ -1554,32 +1359,32 @@
           <w:rFonts w:asciiTheme="majorHAnsi" w:hAnsiTheme="majorHAnsi"/>
           <w:lang w:val="en-US"/>
         </w:rPr>
-        <w:t>: waste_type_id</w:t>
-      </w:r>
-    </w:p>
-    <w:p>
-      <w:pPr>
-        <w:spacing w:after="0" w:line="240" w:lineRule="auto"/>
-        <w:rPr>
-          <w:rFonts w:asciiTheme="majorHAnsi" w:hAnsiTheme="majorHAnsi"/>
-          <w:lang w:val="en-US"/>
-        </w:rPr>
-      </w:pPr>
-    </w:p>
-    <w:p>
-      <w:pPr>
-        <w:spacing w:after="0" w:line="240" w:lineRule="auto"/>
-        <w:rPr>
-          <w:rFonts w:asciiTheme="majorHAnsi" w:hAnsiTheme="majorHAnsi"/>
-          <w:lang w:val="en-US"/>
-        </w:rPr>
-      </w:pPr>
-      <w:r>
-        <w:rPr>
-          <w:rFonts w:asciiTheme="majorHAnsi" w:hAnsiTheme="majorHAnsi"/>
-          <w:lang w:val="en-US"/>
-        </w:rPr>
-        <w:t>COLLECTION (</w:t>
+        <w:t>: contract_no</w:t>
+      </w:r>
+    </w:p>
+    <w:p>
+      <w:pPr>
+        <w:spacing w:after="0" w:line="240" w:lineRule="auto"/>
+        <w:rPr>
+          <w:rFonts w:asciiTheme="majorHAnsi" w:hAnsiTheme="majorHAnsi"/>
+          <w:lang w:val="en-US"/>
+        </w:rPr>
+      </w:pPr>
+    </w:p>
+    <w:p>
+      <w:pPr>
+        <w:spacing w:after="0" w:line="240" w:lineRule="auto"/>
+        <w:rPr>
+          <w:rFonts w:asciiTheme="majorHAnsi" w:hAnsiTheme="majorHAnsi"/>
+          <w:lang w:val="en-US"/>
+        </w:rPr>
+      </w:pPr>
+      <w:r>
+        <w:rPr>
+          <w:rFonts w:asciiTheme="majorHAnsi" w:hAnsiTheme="majorHAnsi"/>
+          <w:lang w:val="en-US"/>
+        </w:rPr>
+        <w:t>WASTE_TYPE (</w:t>
       </w:r>
       <w:r>
         <w:rPr>
@@ -1587,29 +1392,14 @@
           <w:u w:val="single"/>
           <w:lang w:val="en-US"/>
         </w:rPr>
-        <w:t>contract_no</w:t>
-      </w:r>
-      <w:r>
-        <w:rPr>
-          <w:rFonts w:asciiTheme="majorHAnsi" w:hAnsiTheme="majorHAnsi"/>
-          <w:lang w:val="en-US"/>
-        </w:rPr>
-        <w:t xml:space="preserve">, </w:t>
-      </w:r>
-      <w:r>
-        <w:rPr>
-          <w:rFonts w:asciiTheme="majorHAnsi" w:hAnsiTheme="majorHAnsi"/>
-          <w:u w:val="single"/>
-          <w:lang w:val="en-US"/>
-        </w:rPr>
-        <w:t>collect_date</w:t>
-      </w:r>
-      <w:r>
-        <w:rPr>
-          <w:rFonts w:asciiTheme="majorHAnsi" w:hAnsiTheme="majorHAnsi"/>
-          <w:lang w:val="en-US"/>
-        </w:rPr>
-        <w:t>, truck_vin)</w:t>
+        <w:t>waste_type_id</w:t>
+      </w:r>
+      <w:r>
+        <w:rPr>
+          <w:rFonts w:asciiTheme="majorHAnsi" w:hAnsiTheme="majorHAnsi"/>
+          <w:lang w:val="en-US"/>
+        </w:rPr>
+        <w:t>, waste_type_desc)</w:t>
       </w:r>
     </w:p>
     <w:p>
@@ -1627,14 +1417,69 @@
           <w:bCs/>
           <w:lang w:val="en-US"/>
         </w:rPr>
-        <w:t>CK:</w:t>
-      </w:r>
-      <w:r>
-        <w:rPr>
-          <w:rFonts w:asciiTheme="majorHAnsi" w:hAnsiTheme="majorHAnsi"/>
-          <w:lang w:val="en-US"/>
-        </w:rPr>
-        <w:t xml:space="preserve"> contract_no, collect_date</w:t>
+        <w:t>CK</w:t>
+      </w:r>
+      <w:r>
+        <w:rPr>
+          <w:rFonts w:asciiTheme="majorHAnsi" w:hAnsiTheme="majorHAnsi"/>
+          <w:lang w:val="en-US"/>
+        </w:rPr>
+        <w:t>: waste_type_id</w:t>
+      </w:r>
+    </w:p>
+    <w:p>
+      <w:pPr>
+        <w:spacing w:after="0" w:line="240" w:lineRule="auto"/>
+        <w:rPr>
+          <w:rFonts w:asciiTheme="majorHAnsi" w:hAnsiTheme="majorHAnsi"/>
+          <w:lang w:val="en-US"/>
+        </w:rPr>
+      </w:pPr>
+    </w:p>
+    <w:p>
+      <w:pPr>
+        <w:spacing w:after="0" w:line="240" w:lineRule="auto"/>
+        <w:rPr>
+          <w:rFonts w:asciiTheme="majorHAnsi" w:hAnsiTheme="majorHAnsi"/>
+          <w:lang w:val="en-US"/>
+        </w:rPr>
+      </w:pPr>
+      <w:r>
+        <w:rPr>
+          <w:rFonts w:asciiTheme="majorHAnsi" w:hAnsiTheme="majorHAnsi"/>
+          <w:lang w:val="en-US"/>
+        </w:rPr>
+        <w:t>COLLECTION (</w:t>
+      </w:r>
+      <w:r>
+        <w:rPr>
+          <w:rFonts w:asciiTheme="majorHAnsi" w:hAnsiTheme="majorHAnsi"/>
+          <w:u w:val="single"/>
+          <w:lang w:val="en-US"/>
+        </w:rPr>
+        <w:t>contract_no</w:t>
+      </w:r>
+      <w:r>
+        <w:rPr>
+          <w:rFonts w:asciiTheme="majorHAnsi" w:hAnsiTheme="majorHAnsi"/>
+          <w:lang w:val="en-US"/>
+        </w:rPr>
+        <w:t xml:space="preserve">, </w:t>
+      </w:r>
+      <w:r>
+        <w:rPr>
+          <w:rFonts w:asciiTheme="majorHAnsi" w:hAnsiTheme="majorHAnsi"/>
+          <w:u w:val="single"/>
+          <w:lang w:val="en-US"/>
+        </w:rPr>
+        <w:t>collect_date</w:t>
+      </w:r>
+      <w:r>
+        <w:rPr>
+          <w:rFonts w:asciiTheme="majorHAnsi" w:hAnsiTheme="majorHAnsi"/>
+          <w:lang w:val="en-US"/>
+        </w:rPr>
+        <w:t>, truck_vin)</w:t>
       </w:r>
     </w:p>
     <w:p>
@@ -1659,95 +1504,7 @@
           <w:rFonts w:asciiTheme="majorHAnsi" w:hAnsiTheme="majorHAnsi"/>
           <w:lang w:val="en-US"/>
         </w:rPr>
-        <w:t xml:space="preserve"> truck_vin, collect_date</w:t>
-      </w:r>
-    </w:p>
-    <w:p>
-      <w:pPr>
-        <w:spacing w:after="0" w:line="240" w:lineRule="auto"/>
-        <w:rPr>
-          <w:rFonts w:asciiTheme="majorHAnsi" w:hAnsiTheme="majorHAnsi"/>
-          <w:lang w:val="en-US"/>
-        </w:rPr>
-      </w:pPr>
-    </w:p>
-    <w:p>
-      <w:pPr>
-        <w:spacing w:after="0" w:line="240" w:lineRule="auto"/>
-        <w:rPr>
-          <w:rFonts w:asciiTheme="majorHAnsi" w:hAnsiTheme="majorHAnsi"/>
-          <w:lang w:val="en-US"/>
-        </w:rPr>
-      </w:pPr>
-      <w:r>
-        <w:rPr>
-          <w:rFonts w:asciiTheme="majorHAnsi" w:hAnsiTheme="majorHAnsi"/>
-          <w:lang w:val="en-US"/>
-        </w:rPr>
-        <w:t>TRUCK (</w:t>
-      </w:r>
-      <w:r>
-        <w:rPr>
-          <w:rFonts w:asciiTheme="majorHAnsi" w:hAnsiTheme="majorHAnsi"/>
-          <w:u w:val="single"/>
-          <w:lang w:val="en-US"/>
-        </w:rPr>
-        <w:t>truck_vin</w:t>
-      </w:r>
-      <w:r>
-        <w:rPr>
-          <w:rFonts w:asciiTheme="majorHAnsi" w:hAnsiTheme="majorHAnsi"/>
-          <w:lang w:val="en-US"/>
-        </w:rPr>
-        <w:t xml:space="preserve">, truck_rego, </w:t>
-      </w:r>
-      <w:proofErr w:type="spellStart"/>
-      <w:r>
-        <w:rPr>
-          <w:rFonts w:asciiTheme="majorHAnsi" w:hAnsiTheme="majorHAnsi"/>
-          <w:lang w:val="en-US"/>
-        </w:rPr>
-        <w:t>truck_make</w:t>
-      </w:r>
-      <w:proofErr w:type="spellEnd"/>
-      <w:r>
-        <w:rPr>
-          <w:rFonts w:asciiTheme="majorHAnsi" w:hAnsiTheme="majorHAnsi"/>
-          <w:lang w:val="en-US"/>
-        </w:rPr>
-        <w:t xml:space="preserve">, </w:t>
-      </w:r>
-      <w:proofErr w:type="spellStart"/>
-      <w:r>
-        <w:rPr>
-          <w:rFonts w:asciiTheme="majorHAnsi" w:hAnsiTheme="majorHAnsi"/>
-          <w:lang w:val="en-US"/>
-        </w:rPr>
-        <w:t>truck_model</w:t>
-      </w:r>
-      <w:proofErr w:type="spellEnd"/>
-      <w:r>
-        <w:rPr>
-          <w:rFonts w:asciiTheme="majorHAnsi" w:hAnsiTheme="majorHAnsi"/>
-          <w:lang w:val="en-US"/>
-        </w:rPr>
-        <w:t xml:space="preserve">, </w:t>
-      </w:r>
-      <w:proofErr w:type="spellStart"/>
-      <w:r>
-        <w:rPr>
-          <w:rFonts w:asciiTheme="majorHAnsi" w:hAnsiTheme="majorHAnsi"/>
-          <w:lang w:val="en-US"/>
-        </w:rPr>
-        <w:t>truck_year</w:t>
-      </w:r>
-      <w:proofErr w:type="spellEnd"/>
-      <w:r>
-        <w:rPr>
-          <w:rFonts w:asciiTheme="majorHAnsi" w:hAnsiTheme="majorHAnsi"/>
-          <w:lang w:val="en-US"/>
-        </w:rPr>
-        <w:t>)</w:t>
+        <w:t xml:space="preserve"> contract_no, collect_date</w:t>
       </w:r>
     </w:p>
     <w:p>
@@ -1765,14 +1522,86 @@
           <w:bCs/>
           <w:lang w:val="en-US"/>
         </w:rPr>
-        <w:t>CK</w:t>
-      </w:r>
-      <w:r>
-        <w:rPr>
-          <w:rFonts w:asciiTheme="majorHAnsi" w:hAnsiTheme="majorHAnsi"/>
-          <w:lang w:val="en-US"/>
-        </w:rPr>
-        <w:t>: truck_vin</w:t>
+        <w:t>CK:</w:t>
+      </w:r>
+      <w:r>
+        <w:rPr>
+          <w:rFonts w:asciiTheme="majorHAnsi" w:hAnsiTheme="majorHAnsi"/>
+          <w:lang w:val="en-US"/>
+        </w:rPr>
+        <w:t xml:space="preserve"> truck_vin, collect_date</w:t>
+      </w:r>
+    </w:p>
+    <w:p>
+      <w:pPr>
+        <w:spacing w:after="0" w:line="240" w:lineRule="auto"/>
+        <w:rPr>
+          <w:rFonts w:asciiTheme="majorHAnsi" w:hAnsiTheme="majorHAnsi"/>
+          <w:lang w:val="en-US"/>
+        </w:rPr>
+      </w:pPr>
+    </w:p>
+    <w:p>
+      <w:pPr>
+        <w:spacing w:after="0" w:line="240" w:lineRule="auto"/>
+        <w:rPr>
+          <w:rFonts w:asciiTheme="majorHAnsi" w:hAnsiTheme="majorHAnsi"/>
+          <w:lang w:val="en-US"/>
+        </w:rPr>
+      </w:pPr>
+      <w:r>
+        <w:rPr>
+          <w:rFonts w:asciiTheme="majorHAnsi" w:hAnsiTheme="majorHAnsi"/>
+          <w:lang w:val="en-US"/>
+        </w:rPr>
+        <w:t>TRUCK (</w:t>
+      </w:r>
+      <w:r>
+        <w:rPr>
+          <w:rFonts w:asciiTheme="majorHAnsi" w:hAnsiTheme="majorHAnsi"/>
+          <w:u w:val="single"/>
+          <w:lang w:val="en-US"/>
+        </w:rPr>
+        <w:t>truck_vin</w:t>
+      </w:r>
+      <w:r>
+        <w:rPr>
+          <w:rFonts w:asciiTheme="majorHAnsi" w:hAnsiTheme="majorHAnsi"/>
+          <w:lang w:val="en-US"/>
+        </w:rPr>
+        <w:t xml:space="preserve">, truck_rego, truck_make, </w:t>
+      </w:r>
+      <w:proofErr w:type="spellStart"/>
+      <w:r>
+        <w:rPr>
+          <w:rFonts w:asciiTheme="majorHAnsi" w:hAnsiTheme="majorHAnsi"/>
+          <w:lang w:val="en-US"/>
+        </w:rPr>
+        <w:t>truck_model</w:t>
+      </w:r>
+      <w:proofErr w:type="spellEnd"/>
+      <w:r>
+        <w:rPr>
+          <w:rFonts w:asciiTheme="majorHAnsi" w:hAnsiTheme="majorHAnsi"/>
+          <w:lang w:val="en-US"/>
+        </w:rPr>
+        <w:t xml:space="preserve">, </w:t>
+      </w:r>
+      <w:proofErr w:type="spellStart"/>
+      <w:r>
+        <w:rPr>
+          <w:rFonts w:asciiTheme="majorHAnsi" w:hAnsiTheme="majorHAnsi"/>
+          <w:lang w:val="en-US"/>
+        </w:rPr>
+        <w:t>truck_year</w:t>
+      </w:r>
+      <w:proofErr w:type="spellEnd"/>
+      <w:r>
+        <w:rPr>
+          <w:rFonts w:asciiTheme="majorHAnsi" w:hAnsiTheme="majorHAnsi"/>
+          <w:lang w:val="en-US"/>
+        </w:rPr>
+        <w:t>)</w:t>
       </w:r>
     </w:p>
     <w:p>
@@ -1790,91 +1619,14 @@
           <w:bCs/>
           <w:lang w:val="en-US"/>
         </w:rPr>
-        <w:t>CK:</w:t>
-      </w:r>
-      <w:r>
-        <w:rPr>
-          <w:rFonts w:asciiTheme="majorHAnsi" w:hAnsiTheme="majorHAnsi"/>
-          <w:lang w:val="en-US"/>
-        </w:rPr>
-        <w:t xml:space="preserve"> truck_rego</w:t>
-      </w:r>
-    </w:p>
-    <w:p>
-      <w:pPr>
-        <w:spacing w:after="0" w:line="240" w:lineRule="auto"/>
-        <w:rPr>
-          <w:rFonts w:asciiTheme="majorHAnsi" w:hAnsiTheme="majorHAnsi"/>
-          <w:lang w:val="en-US"/>
-        </w:rPr>
-      </w:pPr>
-    </w:p>
-    <w:p>
-      <w:pPr>
-        <w:spacing w:after="0" w:line="240" w:lineRule="auto"/>
-        <w:rPr>
-          <w:rFonts w:asciiTheme="majorHAnsi" w:hAnsiTheme="majorHAnsi"/>
-          <w:lang w:val="en-US"/>
-        </w:rPr>
-      </w:pPr>
-      <w:r>
-        <w:rPr>
-          <w:rFonts w:asciiTheme="majorHAnsi" w:hAnsiTheme="majorHAnsi"/>
-          <w:lang w:val="en-US"/>
-        </w:rPr>
-        <w:t>BIN_</w:t>
-      </w:r>
-      <w:r>
-        <w:rPr>
-          <w:rFonts w:asciiTheme="majorHAnsi" w:hAnsiTheme="majorHAnsi"/>
-          <w:lang w:val="en-US"/>
-        </w:rPr>
-        <w:t>COLLECTION (</w:t>
-      </w:r>
-      <w:r>
-        <w:rPr>
-          <w:rFonts w:asciiTheme="majorHAnsi" w:hAnsiTheme="majorHAnsi"/>
-          <w:u w:val="single"/>
-          <w:lang w:val="en-US"/>
-        </w:rPr>
-        <w:t>contract_no,</w:t>
-      </w:r>
-      <w:r>
-        <w:rPr>
-          <w:rFonts w:asciiTheme="majorHAnsi" w:hAnsiTheme="majorHAnsi"/>
-          <w:lang w:val="en-US"/>
-        </w:rPr>
-        <w:t xml:space="preserve"> </w:t>
-      </w:r>
-      <w:r>
-        <w:rPr>
-          <w:rFonts w:asciiTheme="majorHAnsi" w:hAnsiTheme="majorHAnsi"/>
-          <w:u w:val="single"/>
-          <w:lang w:val="en-US"/>
-        </w:rPr>
-        <w:t>collect_date,</w:t>
-      </w:r>
-      <w:r>
-        <w:rPr>
-          <w:rFonts w:asciiTheme="majorHAnsi" w:hAnsiTheme="majorHAnsi"/>
-          <w:lang w:val="en-US"/>
-        </w:rPr>
-        <w:t xml:space="preserve"> </w:t>
-      </w:r>
-      <w:r>
-        <w:rPr>
-          <w:rFonts w:asciiTheme="majorHAnsi" w:hAnsiTheme="majorHAnsi"/>
-          <w:u w:val="single"/>
-          <w:lang w:val="en-US"/>
-        </w:rPr>
-        <w:t>bin_rfid</w:t>
-      </w:r>
-      <w:r>
-        <w:rPr>
-          <w:rFonts w:asciiTheme="majorHAnsi" w:hAnsiTheme="majorHAnsi"/>
-          <w:lang w:val="en-US"/>
-        </w:rPr>
-        <w:t>, collected_kgs, overweight)</w:t>
+        <w:t>CK</w:t>
+      </w:r>
+      <w:r>
+        <w:rPr>
+          <w:rFonts w:asciiTheme="majorHAnsi" w:hAnsiTheme="majorHAnsi"/>
+          <w:lang w:val="en-US"/>
+        </w:rPr>
+        <w:t>: truck_vin</w:t>
       </w:r>
     </w:p>
     <w:p>
@@ -1899,6 +1651,101 @@
           <w:rFonts w:asciiTheme="majorHAnsi" w:hAnsiTheme="majorHAnsi"/>
           <w:lang w:val="en-US"/>
         </w:rPr>
+        <w:t xml:space="preserve"> truck_rego</w:t>
+      </w:r>
+    </w:p>
+    <w:p>
+      <w:pPr>
+        <w:spacing w:after="0" w:line="240" w:lineRule="auto"/>
+        <w:rPr>
+          <w:rFonts w:asciiTheme="majorHAnsi" w:hAnsiTheme="majorHAnsi"/>
+          <w:lang w:val="en-US"/>
+        </w:rPr>
+      </w:pPr>
+    </w:p>
+    <w:p>
+      <w:pPr>
+        <w:spacing w:after="0" w:line="240" w:lineRule="auto"/>
+        <w:rPr>
+          <w:rFonts w:asciiTheme="majorHAnsi" w:hAnsiTheme="majorHAnsi"/>
+          <w:lang w:val="en-US"/>
+        </w:rPr>
+      </w:pPr>
+      <w:r>
+        <w:rPr>
+          <w:rFonts w:asciiTheme="majorHAnsi" w:hAnsiTheme="majorHAnsi"/>
+          <w:lang w:val="en-US"/>
+        </w:rPr>
+        <w:t>BIN_COLLECTION (</w:t>
+      </w:r>
+      <w:r>
+        <w:rPr>
+          <w:rFonts w:asciiTheme="majorHAnsi" w:hAnsiTheme="majorHAnsi"/>
+          <w:u w:val="single"/>
+          <w:lang w:val="en-US"/>
+        </w:rPr>
+        <w:t>contract_no,</w:t>
+      </w:r>
+      <w:r>
+        <w:rPr>
+          <w:rFonts w:asciiTheme="majorHAnsi" w:hAnsiTheme="majorHAnsi"/>
+          <w:lang w:val="en-US"/>
+        </w:rPr>
+        <w:t xml:space="preserve"> </w:t>
+      </w:r>
+      <w:r>
+        <w:rPr>
+          <w:rFonts w:asciiTheme="majorHAnsi" w:hAnsiTheme="majorHAnsi"/>
+          <w:u w:val="single"/>
+          <w:lang w:val="en-US"/>
+        </w:rPr>
+        <w:t>collect_date,</w:t>
+      </w:r>
+      <w:r>
+        <w:rPr>
+          <w:rFonts w:asciiTheme="majorHAnsi" w:hAnsiTheme="majorHAnsi"/>
+          <w:lang w:val="en-US"/>
+        </w:rPr>
+        <w:t xml:space="preserve"> </w:t>
+      </w:r>
+      <w:r>
+        <w:rPr>
+          <w:rFonts w:asciiTheme="majorHAnsi" w:hAnsiTheme="majorHAnsi"/>
+          <w:u w:val="single"/>
+          <w:lang w:val="en-US"/>
+        </w:rPr>
+        <w:t>bin_rfid</w:t>
+      </w:r>
+      <w:r>
+        <w:rPr>
+          <w:rFonts w:asciiTheme="majorHAnsi" w:hAnsiTheme="majorHAnsi"/>
+          <w:lang w:val="en-US"/>
+        </w:rPr>
+        <w:t>, collected_kgs, overweight)</w:t>
+      </w:r>
+    </w:p>
+    <w:p>
+      <w:pPr>
+        <w:spacing w:after="0" w:line="240" w:lineRule="auto"/>
+        <w:rPr>
+          <w:rFonts w:asciiTheme="majorHAnsi" w:hAnsiTheme="majorHAnsi"/>
+          <w:lang w:val="en-US"/>
+        </w:rPr>
+      </w:pPr>
+      <w:r>
+        <w:rPr>
+          <w:rFonts w:asciiTheme="majorHAnsi" w:hAnsiTheme="majorHAnsi"/>
+          <w:b/>
+          <w:bCs/>
+          <w:lang w:val="en-US"/>
+        </w:rPr>
+        <w:t>CK:</w:t>
+      </w:r>
+      <w:r>
+        <w:rPr>
+          <w:rFonts w:asciiTheme="majorHAnsi" w:hAnsiTheme="majorHAnsi"/>
+          <w:lang w:val="en-US"/>
+        </w:rPr>
         <w:t xml:space="preserve"> contract_no, collect_date, bin_rfid</w:t>
       </w:r>
     </w:p>
@@ -1910,6 +1757,131 @@
           <w:lang w:val="en-US"/>
         </w:rPr>
       </w:pPr>
+    </w:p>
+    <w:p>
+      <w:pPr>
+        <w:spacing w:after="0" w:line="240" w:lineRule="auto"/>
+        <w:rPr>
+          <w:rFonts w:asciiTheme="majorHAnsi" w:hAnsiTheme="majorHAnsi"/>
+          <w:b/>
+          <w:bCs/>
+          <w:lang w:val="en-US"/>
+        </w:rPr>
+      </w:pPr>
+      <w:r>
+        <w:rPr>
+          <w:rFonts w:asciiTheme="majorHAnsi" w:hAnsiTheme="majorHAnsi"/>
+          <w:b/>
+          <w:bCs/>
+          <w:lang w:val="en-US"/>
+        </w:rPr>
+        <w:t>Full dependencies</w:t>
+      </w:r>
+    </w:p>
+    <w:p>
+      <w:pPr>
+        <w:spacing w:after="0" w:line="240" w:lineRule="auto"/>
+        <w:rPr>
+          <w:rFonts w:asciiTheme="majorHAnsi" w:hAnsiTheme="majorHAnsi"/>
+          <w:lang w:val="en-US"/>
+        </w:rPr>
+      </w:pPr>
+      <w:r>
+        <w:rPr>
+          <w:rFonts w:asciiTheme="majorHAnsi" w:hAnsiTheme="majorHAnsi"/>
+          <w:lang w:val="en-US"/>
+        </w:rPr>
+        <w:t>contract_no → waste_type_id, collection_frequency</w:t>
+      </w:r>
+    </w:p>
+    <w:p>
+      <w:pPr>
+        <w:spacing w:after="0" w:line="240" w:lineRule="auto"/>
+        <w:rPr>
+          <w:rFonts w:asciiTheme="majorHAnsi" w:hAnsiTheme="majorHAnsi"/>
+          <w:lang w:val="en-US"/>
+        </w:rPr>
+      </w:pPr>
+      <w:r>
+        <w:rPr>
+          <w:rFonts w:asciiTheme="majorHAnsi" w:hAnsiTheme="majorHAnsi"/>
+          <w:lang w:val="en-US"/>
+        </w:rPr>
+        <w:t>waste_type_id → waste_type_desc</w:t>
+      </w:r>
+    </w:p>
+    <w:p>
+      <w:pPr>
+        <w:spacing w:after="0" w:line="240" w:lineRule="auto"/>
+        <w:rPr>
+          <w:rFonts w:asciiTheme="majorHAnsi" w:hAnsiTheme="majorHAnsi"/>
+          <w:lang w:val="en-US"/>
+        </w:rPr>
+      </w:pPr>
+      <w:r>
+        <w:rPr>
+          <w:rFonts w:asciiTheme="majorHAnsi" w:hAnsiTheme="majorHAnsi"/>
+          <w:lang w:val="en-US"/>
+        </w:rPr>
+        <w:t>contract_no, collect_date → truck_vin</w:t>
+      </w:r>
+    </w:p>
+    <w:p>
+      <w:pPr>
+        <w:spacing w:after="0" w:line="240" w:lineRule="auto"/>
+        <w:rPr>
+          <w:rFonts w:asciiTheme="majorHAnsi" w:hAnsiTheme="majorHAnsi"/>
+          <w:lang w:val="en-US"/>
+        </w:rPr>
+      </w:pPr>
+      <w:r>
+        <w:rPr>
+          <w:rFonts w:asciiTheme="majorHAnsi" w:hAnsiTheme="majorHAnsi"/>
+          <w:lang w:val="en-US"/>
+        </w:rPr>
+        <w:t xml:space="preserve">truck_vin → truck_rego, truck_make, </w:t>
+      </w:r>
+      <w:proofErr w:type="spellStart"/>
+      <w:r>
+        <w:rPr>
+          <w:rFonts w:asciiTheme="majorHAnsi" w:hAnsiTheme="majorHAnsi"/>
+          <w:lang w:val="en-US"/>
+        </w:rPr>
+        <w:t>truck_model</w:t>
+      </w:r>
+      <w:proofErr w:type="spellEnd"/>
+      <w:r>
+        <w:rPr>
+          <w:rFonts w:asciiTheme="majorHAnsi" w:hAnsiTheme="majorHAnsi"/>
+          <w:lang w:val="en-US"/>
+        </w:rPr>
+        <w:t xml:space="preserve">, </w:t>
+      </w:r>
+      <w:proofErr w:type="spellStart"/>
+      <w:r>
+        <w:rPr>
+          <w:rFonts w:asciiTheme="majorHAnsi" w:hAnsiTheme="majorHAnsi"/>
+          <w:lang w:val="en-US"/>
+        </w:rPr>
+        <w:t>truck_year</w:t>
+      </w:r>
+      <w:proofErr w:type="spellEnd"/>
+    </w:p>
+    <w:p>
+      <w:pPr>
+        <w:spacing w:after="0" w:line="240" w:lineRule="auto"/>
+        <w:rPr>
+          <w:rFonts w:asciiTheme="majorHAnsi" w:hAnsiTheme="majorHAnsi"/>
+          <w:lang w:val="en-US"/>
+        </w:rPr>
+      </w:pPr>
+      <w:r>
+        <w:rPr>
+          <w:rFonts w:asciiTheme="majorHAnsi" w:hAnsiTheme="majorHAnsi"/>
+          <w:lang w:val="en-US"/>
+        </w:rPr>
+        <w:t>contract_no, collect_date, bin_rfid → collected_kgs, overweight</w:t>
+      </w:r>
     </w:p>
     <w:p>
       <w:pPr>

</xml_diff>

<commit_message>
Final submission - all files complete
</commit_message>
<xml_diff>
--- a/Assignments/Ass1/ca_normalisation.docx
+++ b/Assignments/Ass1/ca_normalisation.docx
@@ -22,11 +22,67 @@
         </w:rPr>
         <w:t>NORMALISATION (TASK 2)</w:t>
       </w:r>
-      <w:r>
+    </w:p>
+    <w:p>
+      <w:pPr>
         <w:rPr>
           <w:rFonts w:asciiTheme="majorBidi" w:hAnsiTheme="majorBidi"/>
-          <w:sz w:val="28"/>
-          <w:szCs w:val="28"/>
+          <w:sz w:val="22"/>
+          <w:szCs w:val="22"/>
+          <w:u w:val="single"/>
+          <w:lang w:val="en-US"/>
+        </w:rPr>
+      </w:pPr>
+      <w:proofErr w:type="spellStart"/>
+      <w:proofErr w:type="gramStart"/>
+      <w:r>
+        <w:rPr>
+          <w:rFonts w:asciiTheme="majorBidi" w:hAnsiTheme="majorBidi"/>
+          <w:sz w:val="22"/>
+          <w:szCs w:val="22"/>
+          <w:u w:val="single"/>
+          <w:lang w:val="en-US"/>
+        </w:rPr>
+        <w:t>Name:Ria</w:t>
+      </w:r>
+      <w:proofErr w:type="spellEnd"/>
+      <w:proofErr w:type="gramEnd"/>
+      <w:r>
+        <w:rPr>
+          <w:rFonts w:asciiTheme="majorBidi" w:hAnsiTheme="majorBidi"/>
+          <w:sz w:val="22"/>
+          <w:szCs w:val="22"/>
+          <w:u w:val="single"/>
+          <w:lang w:val="en-US"/>
+        </w:rPr>
+        <w:t xml:space="preserve"> Bansal</w:t>
+      </w:r>
+    </w:p>
+    <w:p>
+      <w:pPr>
+        <w:rPr>
+          <w:rFonts w:asciiTheme="majorBidi" w:hAnsiTheme="majorBidi"/>
+          <w:sz w:val="22"/>
+          <w:szCs w:val="22"/>
+          <w:u w:val="single"/>
+          <w:lang w:val="en-US"/>
+        </w:rPr>
+      </w:pPr>
+      <w:r>
+        <w:rPr>
+          <w:rFonts w:asciiTheme="majorBidi" w:hAnsiTheme="majorBidi"/>
+          <w:sz w:val="22"/>
+          <w:szCs w:val="22"/>
+          <w:u w:val="single"/>
+          <w:lang w:val="en-US"/>
+        </w:rPr>
+        <w:t>Student ID: 34267433</w:t>
+      </w:r>
+      <w:r>
+        <w:rPr>
+          <w:rFonts w:asciiTheme="majorBidi" w:hAnsiTheme="majorBidi"/>
+          <w:sz w:val="22"/>
+          <w:szCs w:val="22"/>
           <w:u w:val="single"/>
           <w:lang w:val="en-US"/>
         </w:rPr>
@@ -1011,26 +1067,28 @@
     </w:p>
     <w:p>
       <w:pPr>
-        <w:spacing w:line="240" w:lineRule="auto"/>
-        <w:rPr>
-          <w:rFonts w:asciiTheme="majorHAnsi" w:hAnsiTheme="majorHAnsi"/>
-          <w:lang w:val="en-US"/>
-        </w:rPr>
-      </w:pPr>
-    </w:p>
-    <w:p>
-      <w:pPr>
-        <w:spacing w:after="0" w:line="240" w:lineRule="auto"/>
-        <w:rPr>
-          <w:rFonts w:asciiTheme="majorHAnsi" w:hAnsiTheme="majorHAnsi"/>
-          <w:lang w:val="en-US"/>
-        </w:rPr>
-      </w:pPr>
-      <w:r>
-        <w:rPr>
-          <w:rFonts w:asciiTheme="majorHAnsi" w:hAnsiTheme="majorHAnsi"/>
-          <w:lang w:val="en-US"/>
-        </w:rPr>
+        <w:rPr>
+          <w:rFonts w:asciiTheme="majorHAnsi" w:hAnsiTheme="majorHAnsi"/>
+          <w:lang w:val="en-US"/>
+        </w:rPr>
+      </w:pPr>
+    </w:p>
+    <w:p>
+      <w:pPr>
+        <w:rPr>
+          <w:rFonts w:asciiTheme="majorBidi" w:hAnsiTheme="majorBidi"/>
+          <w:sz w:val="22"/>
+          <w:szCs w:val="22"/>
+          <w:u w:val="single"/>
+          <w:lang w:val="en-US"/>
+        </w:rPr>
+      </w:pPr>
+      <w:r>
+        <w:rPr>
+          <w:rFonts w:asciiTheme="majorHAnsi" w:hAnsiTheme="majorHAnsi"/>
+          <w:lang w:val="en-US"/>
+        </w:rPr>
+        <w:lastRenderedPageBreak/>
         <w:t>BIN_COLLECTION (</w:t>
       </w:r>
       <w:r>
@@ -1110,7 +1168,6 @@
           <w:bCs/>
           <w:lang w:val="en-US"/>
         </w:rPr>
-        <w:lastRenderedPageBreak/>
         <w:t>CK</w:t>
       </w:r>
       <w:r>
@@ -1937,28 +1994,35 @@
           <w:lang w:val="en-US"/>
         </w:rPr>
       </w:pPr>
-    </w:p>
-    <w:p>
-      <w:pPr>
-        <w:spacing w:after="0" w:line="240" w:lineRule="auto"/>
-        <w:rPr>
-          <w:rFonts w:asciiTheme="majorHAnsi" w:hAnsiTheme="majorHAnsi"/>
-          <w:lang w:val="en-US"/>
-        </w:rPr>
-      </w:pPr>
-      <w:r>
-        <w:rPr>
-          <w:rFonts w:asciiTheme="majorHAnsi" w:hAnsiTheme="majorHAnsi"/>
-          <w:lang w:val="en-US"/>
-        </w:rPr>
-        <w:t xml:space="preserve">No synthesis required </w:t>
-      </w:r>
-      <w:r>
-        <w:rPr>
-          <w:rFonts w:asciiTheme="majorHAnsi" w:hAnsiTheme="majorHAnsi"/>
-          <w:lang w:val="en-US"/>
-        </w:rPr>
-        <w:t xml:space="preserve">, </w:t>
+      <w:r>
+        <w:rPr>
+          <w:rFonts w:asciiTheme="majorHAnsi" w:hAnsiTheme="majorHAnsi"/>
+          <w:lang w:val="en-US"/>
+        </w:rPr>
+        <w:t xml:space="preserve">No synthesis </w:t>
+      </w:r>
+      <w:proofErr w:type="gramStart"/>
+      <w:r>
+        <w:rPr>
+          <w:rFonts w:asciiTheme="majorHAnsi" w:hAnsiTheme="majorHAnsi"/>
+          <w:lang w:val="en-US"/>
+        </w:rPr>
+        <w:t xml:space="preserve">required </w:t>
+      </w:r>
+      <w:r>
+        <w:rPr>
+          <w:rFonts w:asciiTheme="majorHAnsi" w:hAnsiTheme="majorHAnsi"/>
+          <w:lang w:val="en-US"/>
+        </w:rPr>
+        <w:t>,</w:t>
+      </w:r>
+      <w:proofErr w:type="gramEnd"/>
+      <w:r>
+        <w:rPr>
+          <w:rFonts w:asciiTheme="majorHAnsi" w:hAnsiTheme="majorHAnsi"/>
+          <w:lang w:val="en-US"/>
+        </w:rPr>
+        <w:t xml:space="preserve"> </w:t>
       </w:r>
       <w:r>
         <w:rPr>

</xml_diff>